<commit_message>
smll upd x Andrea
</commit_message>
<xml_diff>
--- a/index.docx
+++ b/index.docx
@@ -23,7 +23,7 @@
         <w:pStyle w:val="Date"/>
       </w:pPr>
       <w:r>
-        <w:t xml:space="preserve">28-gennaio-2026</w:t>
+        <w:t xml:space="preserve">06-febbraio-2026</w:t>
       </w:r>
     </w:p>
     <w:bookmarkStart w:id="20" w:name="importazione-dati"/>
@@ -160,8 +160,40 @@
         <w:t xml:space="preserve">(Istat 2025c)</w:t>
       </w:r>
     </w:p>
+    <w:p>
+      <w:pPr>
+        <w:pStyle w:val="Compact"/>
+        <w:numPr>
+          <w:ilvl w:val="0"/>
+          <w:numId w:val="1006"/>
+        </w:numPr>
+      </w:pPr>
+      <w:r>
+        <w:rPr>
+          <w:b/>
+          <w:bCs/>
+        </w:rPr>
+        <w:t xml:space="preserve">Dati Ehis Anziani non autosufficienti</w:t>
+      </w:r>
+      <w:r>
+        <w:br/>
+      </w:r>
+      <w:r>
+        <w:t xml:space="preserve">(</w:t>
+      </w:r>
+      <w:r>
+        <w:rPr>
+          <w:b/>
+          <w:bCs/>
+        </w:rPr>
+        <w:t xml:space="preserve">istatEhisAnzianiNonAutosufficienti2025a?</w:t>
+      </w:r>
+      <w:r>
+        <w:t xml:space="preserve">)</w:t>
+      </w:r>
+    </w:p>
     <w:bookmarkEnd w:id="20"/>
-    <w:bookmarkStart w:id="74" w:name="priorità-ridurre-le-disuguaglianze"/>
+    <w:bookmarkStart w:id="78" w:name="priorità-ridurre-le-disuguaglianze"/>
     <w:p>
       <w:pPr>
         <w:pStyle w:val="Heading1"/>
@@ -1061,7 +1093,7 @@
               <a:graphicData uri="http://schemas.openxmlformats.org/drawingml/2006/picture">
                 <pic:pic>
                   <pic:nvPicPr>
-                    <pic:cNvPr descr="index_files/figure-docx/unnamed-chunk-5-1.png" id="24" name="Picture"/>
+                    <pic:cNvPr descr="index_files/figure-docx/unnamed-chunk-6-1.png" id="24" name="Picture"/>
                     <pic:cNvPicPr>
                       <a:picLocks noChangeArrowheads="1" noChangeAspect="1"/>
                     </pic:cNvPicPr>
@@ -1096,7 +1128,7 @@
     </w:p>
     <w:bookmarkEnd w:id="25"/>
     <w:bookmarkEnd w:id="26"/>
-    <w:bookmarkStart w:id="41" w:name="popolazione-per-4-distretti"/>
+    <w:bookmarkStart w:id="45" w:name="popolazione-per-4-distretti"/>
     <w:p>
       <w:pPr>
         <w:pStyle w:val="Heading2"/>
@@ -2380,14 +2412,13 @@
       </w:r>
     </w:p>
     <w:bookmarkEnd w:id="40"/>
-    <w:bookmarkEnd w:id="41"/>
-    <w:bookmarkStart w:id="73" w:name="trend-demografici-a-confronto"/>
+    <w:bookmarkStart w:id="44" w:name="persone-over-65-non-autosufficienti"/>
     <w:p>
       <w:pPr>
-        <w:pStyle w:val="Heading2"/>
+        <w:pStyle w:val="Heading3"/>
       </w:pPr>
       <w:r>
-        <w:t xml:space="preserve">Trend demografici a confronto</w:t>
+        <w:t xml:space="preserve">Persone over 65 non autosufficienti</w:t>
       </w:r>
     </w:p>
     <w:p>
@@ -2395,24 +2426,23 @@
         <w:pStyle w:val="FirstParagraph"/>
       </w:pPr>
       <w:r>
-        <w:t xml:space="preserve">In generale, l’analisi degli indicatori demografici 2002-2025 come il profilo demografico di Parma si distingue per certi indicatori sia dalla media regionale che nazionale. In particolare, si evidenzia un trend di invecchiamento più contenuto e una dinamica migratoria più vivace che contribuisce a bilanciare il deficit di natalità generalizzato.</w:t>
-      </w:r>
-    </w:p>
-    <w:bookmarkStart w:id="45" w:name="età-media"/>
-    <w:p>
-      <w:pPr>
-        <w:pStyle w:val="Heading3"/>
-      </w:pPr>
-      <w:r>
-        <w:t xml:space="preserve">Età media</w:t>
-      </w:r>
-    </w:p>
-    <w:p>
-      <w:pPr>
-        <w:pStyle w:val="FirstParagraph"/>
-      </w:pPr>
-      <w:r>
-        <w:t xml:space="preserve">Aumento della popolazione anziana e longevità</w:t>
+        <w:t xml:space="preserve">Questo dato dall’indagine europea sulla salute (EHIS), attualmente in corso di aggiornamento, mostra la significativa percentuale di popolazione anziana (65+) che presenta difficoltà nelle attività di cura della persona (</w:t>
+      </w:r>
+      <w:r>
+        <w:t xml:space="preserve"> </w:t>
+      </w:r>
+      <w:r>
+        <w:rPr>
+          <w:i/>
+          <w:iCs/>
+        </w:rPr>
+        <w:t xml:space="preserve">ADL, Activities of Daily Living</w:t>
+      </w:r>
+      <w:r>
+        <w:t xml:space="preserve"> </w:t>
+      </w:r>
+      <w:r>
+        <w:t xml:space="preserve">), sia essa moderata o grave.</w:t>
       </w:r>
     </w:p>
     <w:p>
@@ -2420,22 +2450,30 @@
         <w:pStyle w:val="BodyText"/>
       </w:pPr>
       <w:r>
+        <w:t xml:space="preserve">(Istat 2022)</w:t>
+      </w:r>
+    </w:p>
+    <w:p>
+      <w:pPr>
+        <w:pStyle w:val="BodyText"/>
+      </w:pPr>
+      <w:r>
         <w:drawing>
           <wp:inline>
             <wp:extent cx="5334000" cy="4000500"/>
             <wp:effectExtent b="0" l="0" r="0" t="0"/>
-            <wp:docPr descr="" title="" id="43" name="Picture"/>
+            <wp:docPr descr="" title="" id="42" name="Picture"/>
             <a:graphic>
               <a:graphicData uri="http://schemas.openxmlformats.org/drawingml/2006/picture">
                 <pic:pic>
                   <pic:nvPicPr>
-                    <pic:cNvPr descr="index_files/figure-docx/e_m_plot-1.png" id="44" name="Picture"/>
+                    <pic:cNvPr descr="index_files/figure-docx/adl_reg_plot-1.png" id="43" name="Picture"/>
                     <pic:cNvPicPr>
                       <a:picLocks noChangeArrowheads="1" noChangeAspect="1"/>
                     </pic:cNvPicPr>
                   </pic:nvPicPr>
                   <pic:blipFill>
-                    <a:blip r:embed="rId42"/>
+                    <a:blip r:embed="rId41"/>
                     <a:stretch>
                       <a:fillRect/>
                     </a:stretch>
@@ -2462,19 +2500,45 @@
         </w:drawing>
       </w:r>
     </w:p>
+    <w:bookmarkEnd w:id="44"/>
     <w:bookmarkEnd w:id="45"/>
-    <w:bookmarkStart w:id="49" w:name="indice-di-vecchiaia"/>
+    <w:bookmarkStart w:id="77" w:name="trend-demografici-a-confronto"/>
+    <w:p>
+      <w:pPr>
+        <w:pStyle w:val="Heading2"/>
+      </w:pPr>
+      <w:r>
+        <w:t xml:space="preserve">Trend demografici a confronto</w:t>
+      </w:r>
+    </w:p>
+    <w:p>
+      <w:pPr>
+        <w:pStyle w:val="FirstParagraph"/>
+      </w:pPr>
+      <w:r>
+        <w:t xml:space="preserve">In generale, l’analisi degli indicatori demografici 2002-2025 come il profilo demografico di Parma si distingue per certi indicatori sia dalla media regionale che nazionale. In particolare, si evidenzia un trend di invecchiamento più contenuto e una dinamica migratoria più vivace che contribuisce a bilanciare il deficit di natalità generalizzato.</w:t>
+      </w:r>
+    </w:p>
+    <w:bookmarkStart w:id="49" w:name="età-media"/>
     <w:p>
       <w:pPr>
         <w:pStyle w:val="Heading3"/>
       </w:pPr>
       <w:r>
-        <w:t xml:space="preserve">Indice di vecchiaia</w:t>
+        <w:t xml:space="preserve">Età media</w:t>
       </w:r>
     </w:p>
     <w:p>
       <w:pPr>
         <w:pStyle w:val="FirstParagraph"/>
+      </w:pPr>
+      <w:r>
+        <w:t xml:space="preserve">Aumento della popolazione anziana e longevità</w:t>
+      </w:r>
+    </w:p>
+    <w:p>
+      <w:pPr>
+        <w:pStyle w:val="BodyText"/>
       </w:pPr>
       <w:r>
         <w:drawing>
@@ -2486,7 +2550,7 @@
               <a:graphicData uri="http://schemas.openxmlformats.org/drawingml/2006/picture">
                 <pic:pic>
                   <pic:nvPicPr>
-                    <pic:cNvPr descr="index_files/figure-docx/i_v_plot-1.png" id="48" name="Picture"/>
+                    <pic:cNvPr descr="index_files/figure-docx/e_m_plot-1.png" id="48" name="Picture"/>
                     <pic:cNvPicPr>
                       <a:picLocks noChangeArrowheads="1" noChangeAspect="1"/>
                     </pic:cNvPicPr>
@@ -2520,13 +2584,13 @@
       </w:r>
     </w:p>
     <w:bookmarkEnd w:id="49"/>
-    <w:bookmarkStart w:id="53" w:name="indice-di-dipendenza-anziani"/>
+    <w:bookmarkStart w:id="53" w:name="indice-di-vecchiaia"/>
     <w:p>
       <w:pPr>
         <w:pStyle w:val="Heading3"/>
       </w:pPr>
       <w:r>
-        <w:t xml:space="preserve">Indice di dipendenza anziani</w:t>
+        <w:t xml:space="preserve">Indice di vecchiaia</w:t>
       </w:r>
     </w:p>
     <w:p>
@@ -2543,7 +2607,7 @@
               <a:graphicData uri="http://schemas.openxmlformats.org/drawingml/2006/picture">
                 <pic:pic>
                   <pic:nvPicPr>
-                    <pic:cNvPr descr="index_files/figure-docx/i_d_a_plot-1.png" id="52" name="Picture"/>
+                    <pic:cNvPr descr="index_files/figure-docx/i_v_plot-1.png" id="52" name="Picture"/>
                     <pic:cNvPicPr>
                       <a:picLocks noChangeArrowheads="1" noChangeAspect="1"/>
                     </pic:cNvPicPr>
@@ -2577,13 +2641,13 @@
       </w:r>
     </w:p>
     <w:bookmarkEnd w:id="53"/>
-    <w:bookmarkStart w:id="57" w:name="indice-di-dipendenza-strutturale"/>
+    <w:bookmarkStart w:id="57" w:name="indice-di-dipendenza-anziani"/>
     <w:p>
       <w:pPr>
         <w:pStyle w:val="Heading3"/>
       </w:pPr>
       <w:r>
-        <w:t xml:space="preserve">Indice di dipendenza strutturale</w:t>
+        <w:t xml:space="preserve">Indice di dipendenza anziani</w:t>
       </w:r>
     </w:p>
     <w:p>
@@ -2600,7 +2664,7 @@
               <a:graphicData uri="http://schemas.openxmlformats.org/drawingml/2006/picture">
                 <pic:pic>
                   <pic:nvPicPr>
-                    <pic:cNvPr descr="index_files/figure-docx/i_d_s_plot-1.png" id="56" name="Picture"/>
+                    <pic:cNvPr descr="index_files/figure-docx/i_d_a_plot-1.png" id="56" name="Picture"/>
                     <pic:cNvPicPr>
                       <a:picLocks noChangeArrowheads="1" noChangeAspect="1"/>
                     </pic:cNvPicPr>
@@ -2634,13 +2698,13 @@
       </w:r>
     </w:p>
     <w:bookmarkEnd w:id="57"/>
-    <w:bookmarkStart w:id="61" w:name="crescita-naturale-della-popolazione"/>
+    <w:bookmarkStart w:id="61" w:name="indice-di-dipendenza-strutturale"/>
     <w:p>
       <w:pPr>
         <w:pStyle w:val="Heading3"/>
       </w:pPr>
       <w:r>
-        <w:t xml:space="preserve">Crescita naturale della popolazione</w:t>
+        <w:t xml:space="preserve">Indice di dipendenza strutturale</w:t>
       </w:r>
     </w:p>
     <w:p>
@@ -2657,7 +2721,7 @@
               <a:graphicData uri="http://schemas.openxmlformats.org/drawingml/2006/picture">
                 <pic:pic>
                   <pic:nvPicPr>
-                    <pic:cNvPr descr="index_files/figure-docx/c_n_plot-1.png" id="60" name="Picture"/>
+                    <pic:cNvPr descr="index_files/figure-docx/i_d_s_plot-1.png" id="60" name="Picture"/>
                     <pic:cNvPicPr>
                       <a:picLocks noChangeArrowheads="1" noChangeAspect="1"/>
                     </pic:cNvPicPr>
@@ -2691,13 +2755,13 @@
       </w:r>
     </w:p>
     <w:bookmarkEnd w:id="61"/>
-    <w:bookmarkStart w:id="65" w:name="saldo-migratorio"/>
+    <w:bookmarkStart w:id="65" w:name="crescita-naturale-della-popolazione"/>
     <w:p>
       <w:pPr>
         <w:pStyle w:val="Heading3"/>
       </w:pPr>
       <w:r>
-        <w:t xml:space="preserve">Saldo migratorio</w:t>
+        <w:t xml:space="preserve">Crescita naturale della popolazione</w:t>
       </w:r>
     </w:p>
     <w:p>
@@ -2714,7 +2778,7 @@
               <a:graphicData uri="http://schemas.openxmlformats.org/drawingml/2006/picture">
                 <pic:pic>
                   <pic:nvPicPr>
-                    <pic:cNvPr descr="index_files/figure-docx/s_m_plot-1.png" id="64" name="Picture"/>
+                    <pic:cNvPr descr="index_files/figure-docx/c_n_plot-1.png" id="64" name="Picture"/>
                     <pic:cNvPicPr>
                       <a:picLocks noChangeArrowheads="1" noChangeAspect="1"/>
                     </pic:cNvPicPr>
@@ -2748,26 +2812,18 @@
       </w:r>
     </w:p>
     <w:bookmarkEnd w:id="65"/>
-    <w:bookmarkStart w:id="72" w:name="mobilità-dei-laureati"/>
+    <w:bookmarkStart w:id="69" w:name="saldo-migratorio"/>
     <w:p>
       <w:pPr>
         <w:pStyle w:val="Heading3"/>
       </w:pPr>
       <w:r>
-        <w:t xml:space="preserve">Mobilità dei laureati</w:t>
+        <w:t xml:space="preserve">Saldo migratorio</w:t>
       </w:r>
     </w:p>
     <w:p>
       <w:pPr>
         <w:pStyle w:val="FirstParagraph"/>
-      </w:pPr>
-      <w:r>
-        <w:t xml:space="preserve">Parma ed Emilia-Romagna registrano saldi migratori positivi dei laureati (attrazione netta), mentre l’Italia nel complesso perde laureati verso l’estero, con tassi negativi stabilmente tra -2 e -8 per mille nel periodo 2019-2023.</w:t>
-      </w:r>
-    </w:p>
-    <w:p>
-      <w:pPr>
-        <w:pStyle w:val="BodyText"/>
       </w:pPr>
       <w:r>
         <w:drawing>
@@ -2779,7 +2835,7 @@
               <a:graphicData uri="http://schemas.openxmlformats.org/drawingml/2006/picture">
                 <pic:pic>
                   <pic:nvPicPr>
-                    <pic:cNvPr descr="index_files/figure-docx/bes_mob_lau_plot-1.png" id="68" name="Picture"/>
+                    <pic:cNvPr descr="index_files/figure-docx/s_m_plot-1.png" id="68" name="Picture"/>
                     <pic:cNvPicPr>
                       <a:picLocks noChangeArrowheads="1" noChangeAspect="1"/>
                     </pic:cNvPicPr>
@@ -2812,6 +2868,71 @@
         </w:drawing>
       </w:r>
     </w:p>
+    <w:bookmarkEnd w:id="69"/>
+    <w:bookmarkStart w:id="76" w:name="mobilità-dei-laureati"/>
+    <w:p>
+      <w:pPr>
+        <w:pStyle w:val="Heading3"/>
+      </w:pPr>
+      <w:r>
+        <w:t xml:space="preserve">Mobilità dei laureati</w:t>
+      </w:r>
+    </w:p>
+    <w:p>
+      <w:pPr>
+        <w:pStyle w:val="FirstParagraph"/>
+      </w:pPr>
+      <w:r>
+        <w:t xml:space="preserve">Parma ed Emilia-Romagna registrano saldi migratori positivi dei laureati (attrazione netta), mentre l’Italia nel complesso perde laureati verso l’estero, con tassi negativi stabilmente tra -2 e -8 per mille nel periodo 2019-2023.</w:t>
+      </w:r>
+    </w:p>
+    <w:p>
+      <w:pPr>
+        <w:pStyle w:val="BodyText"/>
+      </w:pPr>
+      <w:r>
+        <w:drawing>
+          <wp:inline>
+            <wp:extent cx="5334000" cy="4000500"/>
+            <wp:effectExtent b="0" l="0" r="0" t="0"/>
+            <wp:docPr descr="" title="" id="71" name="Picture"/>
+            <a:graphic>
+              <a:graphicData uri="http://schemas.openxmlformats.org/drawingml/2006/picture">
+                <pic:pic>
+                  <pic:nvPicPr>
+                    <pic:cNvPr descr="index_files/figure-docx/bes_mob_lau_plot-1.png" id="72" name="Picture"/>
+                    <pic:cNvPicPr>
+                      <a:picLocks noChangeArrowheads="1" noChangeAspect="1"/>
+                    </pic:cNvPicPr>
+                  </pic:nvPicPr>
+                  <pic:blipFill>
+                    <a:blip r:embed="rId70"/>
+                    <a:stretch>
+                      <a:fillRect/>
+                    </a:stretch>
+                  </pic:blipFill>
+                  <pic:spPr bwMode="auto">
+                    <a:xfrm>
+                      <a:off x="0" y="0"/>
+                      <a:ext cx="5334000" cy="4000500"/>
+                    </a:xfrm>
+                    <a:prstGeom prst="rect">
+                      <a:avLst/>
+                    </a:prstGeom>
+                    <a:noFill/>
+                    <a:ln w="9525">
+                      <a:noFill/>
+                      <a:headEnd/>
+                      <a:tailEnd/>
+                    </a:ln>
+                  </pic:spPr>
+                </pic:pic>
+              </a:graphicData>
+            </a:graphic>
+          </wp:inline>
+        </w:drawing>
+      </w:r>
+    </w:p>
     <w:tbl>
       <w:tblPr>
         <w:tblStyle w:val="Table"/>
@@ -2854,18 +2975,18 @@
                 <wp:inline>
                   <wp:extent cx="152400" cy="152400"/>
                   <wp:effectExtent b="0" l="0" r="0" t="0"/>
-                  <wp:docPr descr="" title="" id="70" name="Picture"/>
+                  <wp:docPr descr="" title="" id="74" name="Picture"/>
                   <a:graphic>
                     <a:graphicData uri="http://schemas.openxmlformats.org/drawingml/2006/picture">
                       <pic:pic>
                         <pic:nvPicPr>
-                          <pic:cNvPr descr="/Applications/RStudio.app/Contents/Resources/app/quarto/share/formats/docx/note.png" id="71" name="Picture"/>
+                          <pic:cNvPr descr="/Applications/RStudio.app/Contents/Resources/app/quarto/share/formats/docx/note.png" id="75" name="Picture"/>
                           <pic:cNvPicPr>
                             <a:picLocks noChangeArrowheads="1" noChangeAspect="1"/>
                           </pic:cNvPicPr>
                         </pic:nvPicPr>
                         <pic:blipFill>
-                          <a:blip r:embed="rId69"/>
+                          <a:blip r:embed="rId73"/>
                           <a:stretch>
                             <a:fillRect/>
                           </a:stretch>
@@ -2943,10 +3064,10 @@
         <w:br w:type="page"/>
       </w:r>
     </w:p>
-    <w:bookmarkEnd w:id="72"/>
-    <w:bookmarkEnd w:id="73"/>
-    <w:bookmarkEnd w:id="74"/>
-    <w:bookmarkStart w:id="75" w:name="section"/>
+    <w:bookmarkEnd w:id="76"/>
+    <w:bookmarkEnd w:id="77"/>
+    <w:bookmarkEnd w:id="78"/>
+    <w:bookmarkStart w:id="79" w:name="section"/>
     <w:p>
       <w:pPr>
         <w:pStyle w:val="Heading1"/>
@@ -2955,8 +3076,8 @@
         <w:t xml:space="preserve">____</w:t>
       </w:r>
     </w:p>
-    <w:bookmarkEnd w:id="75"/>
-    <w:bookmarkStart w:id="111" w:name="X9c6152cf08ae4e10f8c1d05efafc6af7458f9d7"/>
+    <w:bookmarkEnd w:id="79"/>
+    <w:bookmarkStart w:id="115" w:name="X9c6152cf08ae4e10f8c1d05efafc6af7458f9d7"/>
     <w:p>
       <w:pPr>
         <w:pStyle w:val="Heading1"/>
@@ -2976,7 +3097,7 @@
         <w:t xml:space="preserve">come crescita, formazione innovazione, e come messa in rete del proprio contributo. [DPP 2025]”</w:t>
       </w:r>
     </w:p>
-    <w:bookmarkStart w:id="110" w:name="benessere-economico-delle-famiglie"/>
+    <w:bookmarkStart w:id="114" w:name="benessere-economico-delle-famiglie"/>
     <w:p>
       <w:pPr>
         <w:pStyle w:val="Heading2"/>
@@ -3026,7 +3147,7 @@
         <w:t xml:space="preserve">]</w:t>
       </w:r>
     </w:p>
-    <w:bookmarkStart w:id="82" w:name="reddito-medio-da-lavoro-e-pensione"/>
+    <w:bookmarkStart w:id="86" w:name="reddito-medio-da-lavoro-e-pensione"/>
     <w:p>
       <w:pPr>
         <w:pStyle w:val="Heading3"/>
@@ -3100,18 +3221,18 @@
                 <wp:inline>
                   <wp:extent cx="152400" cy="152400"/>
                   <wp:effectExtent b="0" l="0" r="0" t="0"/>
-                  <wp:docPr descr="" title="" id="76" name="Picture"/>
+                  <wp:docPr descr="" title="" id="80" name="Picture"/>
                   <a:graphic>
                     <a:graphicData uri="http://schemas.openxmlformats.org/drawingml/2006/picture">
                       <pic:pic>
                         <pic:nvPicPr>
-                          <pic:cNvPr descr="/Applications/RStudio.app/Contents/Resources/app/quarto/share/formats/docx/note.png" id="77" name="Picture"/>
+                          <pic:cNvPr descr="/Applications/RStudio.app/Contents/Resources/app/quarto/share/formats/docx/note.png" id="81" name="Picture"/>
                           <pic:cNvPicPr>
                             <a:picLocks noChangeArrowheads="1" noChangeAspect="1"/>
                           </pic:cNvPicPr>
                         </pic:nvPicPr>
                         <pic:blipFill>
-                          <a:blip r:embed="rId69"/>
+                          <a:blip r:embed="rId73"/>
                           <a:stretch>
                             <a:fillRect/>
                           </a:stretch>
@@ -3207,7 +3328,7 @@
             <w:pPr>
               <w:numPr>
                 <w:ilvl w:val="0"/>
-                <w:numId w:val="1006"/>
+                <w:numId w:val="1007"/>
               </w:numPr>
             </w:pPr>
             <w:r>
@@ -3246,7 +3367,7 @@
             <w:pPr>
               <w:numPr>
                 <w:ilvl w:val="0"/>
-                <w:numId w:val="1006"/>
+                <w:numId w:val="1007"/>
               </w:numPr>
             </w:pPr>
             <w:r>
@@ -3271,7 +3392,7 @@
             <w:r>
               <w:t xml:space="preserve"> </w:t>
             </w:r>
-            <w:hyperlink r:id="rId78">
+            <w:hyperlink r:id="rId82">
               <w:r>
                 <w:rPr>
                   <w:rStyle w:val="Hyperlink"/>
@@ -3295,18 +3416,18 @@
           <wp:inline>
             <wp:extent cx="5334000" cy="4000500"/>
             <wp:effectExtent b="0" l="0" r="0" t="0"/>
-            <wp:docPr descr="" title="" id="80" name="Picture"/>
+            <wp:docPr descr="" title="" id="84" name="Picture"/>
             <a:graphic>
               <a:graphicData uri="http://schemas.openxmlformats.org/drawingml/2006/picture">
                 <pic:pic>
                   <pic:nvPicPr>
-                    <pic:cNvPr descr="index_files/figure-docx/bes_reddito_barplot-1.png" id="81" name="Picture"/>
+                    <pic:cNvPr descr="index_files/figure-docx/bes_reddito_barplot-1.png" id="85" name="Picture"/>
                     <pic:cNvPicPr>
                       <a:picLocks noChangeArrowheads="1" noChangeAspect="1"/>
                     </pic:cNvPicPr>
                   </pic:nvPicPr>
                   <pic:blipFill>
-                    <a:blip r:embed="rId79"/>
+                    <a:blip r:embed="rId83"/>
                     <a:stretch>
                       <a:fillRect/>
                     </a:stretch>
@@ -3333,8 +3454,8 @@
         </w:drawing>
       </w:r>
     </w:p>
-    <w:bookmarkEnd w:id="82"/>
-    <w:bookmarkStart w:id="84" w:name="tbl-reddito-medio-disponibile-pro-capite"/>
+    <w:bookmarkEnd w:id="86"/>
+    <w:bookmarkStart w:id="88" w:name="tbl-reddito-medio-disponibile-pro-capite"/>
     <w:p>
       <w:pPr>
         <w:pStyle w:val="Heading3"/>
@@ -6178,7 +6299,7 @@
         </w:tc>
       </w:tr>
     </w:tbl>
-    <w:bookmarkStart w:id="83" w:name="maschi-e-femmine"/>
+    <w:bookmarkStart w:id="87" w:name="maschi-e-femmine"/>
     <w:p>
       <w:pPr>
         <w:pStyle w:val="Heading4"/>
@@ -7380,9 +7501,9 @@
         </w:tc>
       </w:tr>
     </w:tbl>
-    <w:bookmarkEnd w:id="83"/>
-    <w:bookmarkEnd w:id="84"/>
-    <w:bookmarkStart w:id="92" w:name="occupazione"/>
+    <w:bookmarkEnd w:id="87"/>
+    <w:bookmarkEnd w:id="88"/>
+    <w:bookmarkStart w:id="96" w:name="occupazione"/>
     <w:p>
       <w:pPr>
         <w:pStyle w:val="Heading3"/>
@@ -7416,18 +7537,18 @@
           <wp:inline>
             <wp:extent cx="5334000" cy="4000500"/>
             <wp:effectExtent b="0" l="0" r="0" t="0"/>
-            <wp:docPr descr="" title="" id="86" name="Picture"/>
+            <wp:docPr descr="" title="" id="90" name="Picture"/>
             <a:graphic>
               <a:graphicData uri="http://schemas.openxmlformats.org/drawingml/2006/picture">
                 <pic:pic>
                   <pic:nvPicPr>
-                    <pic:cNvPr descr="index_files/figure-docx/bes_occup_plot-1.png" id="87" name="Picture"/>
+                    <pic:cNvPr descr="index_files/figure-docx/bes_occup_plot-1.png" id="91" name="Picture"/>
                     <pic:cNvPicPr>
                       <a:picLocks noChangeArrowheads="1" noChangeAspect="1"/>
                     </pic:cNvPicPr>
                   </pic:nvPicPr>
                   <pic:blipFill>
-                    <a:blip r:embed="rId85"/>
+                    <a:blip r:embed="rId89"/>
                     <a:stretch>
                       <a:fillRect/>
                     </a:stretch>
@@ -7454,7 +7575,7 @@
         </w:drawing>
       </w:r>
     </w:p>
-    <w:bookmarkStart w:id="91" w:name="maschi-e-femmine-2024"/>
+    <w:bookmarkStart w:id="95" w:name="maschi-e-femmine-2024"/>
     <w:p>
       <w:pPr>
         <w:pStyle w:val="Heading4"/>
@@ -7472,18 +7593,18 @@
           <wp:inline>
             <wp:extent cx="5334000" cy="4000500"/>
             <wp:effectExtent b="0" l="0" r="0" t="0"/>
-            <wp:docPr descr="" title="" id="89" name="Picture"/>
+            <wp:docPr descr="" title="" id="93" name="Picture"/>
             <a:graphic>
               <a:graphicData uri="http://schemas.openxmlformats.org/drawingml/2006/picture">
                 <pic:pic>
                   <pic:nvPicPr>
-                    <pic:cNvPr descr="index_files/figure-docx/bes_occup_mf_plot-1.png" id="90" name="Picture"/>
+                    <pic:cNvPr descr="index_files/figure-docx/bes_occup_mf_plot-1.png" id="94" name="Picture"/>
                     <pic:cNvPicPr>
                       <a:picLocks noChangeArrowheads="1" noChangeAspect="1"/>
                     </pic:cNvPicPr>
                   </pic:nvPicPr>
                   <pic:blipFill>
-                    <a:blip r:embed="rId88"/>
+                    <a:blip r:embed="rId92"/>
                     <a:stretch>
                       <a:fillRect/>
                     </a:stretch>
@@ -7510,9 +7631,9 @@
         </w:drawing>
       </w:r>
     </w:p>
-    <w:bookmarkEnd w:id="91"/>
-    <w:bookmarkEnd w:id="92"/>
-    <w:bookmarkStart w:id="102" w:name="Xe2aeb8de640d45a015548cf98437c820e84e13a"/>
+    <w:bookmarkEnd w:id="95"/>
+    <w:bookmarkEnd w:id="96"/>
+    <w:bookmarkStart w:id="106" w:name="Xe2aeb8de640d45a015548cf98437c820e84e13a"/>
     <w:p>
       <w:pPr>
         <w:pStyle w:val="Heading3"/>
@@ -7584,18 +7705,18 @@
                 <wp:inline>
                   <wp:extent cx="152400" cy="152400"/>
                   <wp:effectExtent b="0" l="0" r="0" t="0"/>
-                  <wp:docPr descr="" title="" id="93" name="Picture"/>
+                  <wp:docPr descr="" title="" id="97" name="Picture"/>
                   <a:graphic>
                     <a:graphicData uri="http://schemas.openxmlformats.org/drawingml/2006/picture">
                       <pic:pic>
                         <pic:nvPicPr>
-                          <pic:cNvPr descr="/Applications/RStudio.app/Contents/Resources/app/quarto/share/formats/docx/note.png" id="94" name="Picture"/>
+                          <pic:cNvPr descr="/Applications/RStudio.app/Contents/Resources/app/quarto/share/formats/docx/note.png" id="98" name="Picture"/>
                           <pic:cNvPicPr>
                             <a:picLocks noChangeArrowheads="1" noChangeAspect="1"/>
                           </pic:cNvPicPr>
                         </pic:nvPicPr>
                         <pic:blipFill>
-                          <a:blip r:embed="rId69"/>
+                          <a:blip r:embed="rId73"/>
                           <a:stretch>
                             <a:fillRect/>
                           </a:stretch>
@@ -7748,18 +7869,18 @@
           <wp:inline>
             <wp:extent cx="5334000" cy="4000500"/>
             <wp:effectExtent b="0" l="0" r="0" t="0"/>
-            <wp:docPr descr="" title="" id="96" name="Picture"/>
+            <wp:docPr descr="" title="" id="100" name="Picture"/>
             <a:graphic>
               <a:graphicData uri="http://schemas.openxmlformats.org/drawingml/2006/picture">
                 <pic:pic>
                   <pic:nvPicPr>
-                    <pic:cNvPr descr="index_files/figure-docx/bes_disoccup_plot-1.png" id="97" name="Picture"/>
+                    <pic:cNvPr descr="index_files/figure-docx/bes_disoccup_plot-1.png" id="101" name="Picture"/>
                     <pic:cNvPicPr>
                       <a:picLocks noChangeArrowheads="1" noChangeAspect="1"/>
                     </pic:cNvPicPr>
                   </pic:nvPicPr>
                   <pic:blipFill>
-                    <a:blip r:embed="rId95"/>
+                    <a:blip r:embed="rId99"/>
                     <a:stretch>
                       <a:fillRect/>
                     </a:stretch>
@@ -7786,7 +7907,7 @@
         </w:drawing>
       </w:r>
     </w:p>
-    <w:bookmarkStart w:id="101" w:name="maschi-e-femmine-al-2024"/>
+    <w:bookmarkStart w:id="105" w:name="maschi-e-femmine-al-2024"/>
     <w:p>
       <w:pPr>
         <w:pStyle w:val="Heading4"/>
@@ -7804,18 +7925,18 @@
           <wp:inline>
             <wp:extent cx="5334000" cy="4000500"/>
             <wp:effectExtent b="0" l="0" r="0" t="0"/>
-            <wp:docPr descr="" title="" id="99" name="Picture"/>
+            <wp:docPr descr="" title="" id="103" name="Picture"/>
             <a:graphic>
               <a:graphicData uri="http://schemas.openxmlformats.org/drawingml/2006/picture">
                 <pic:pic>
                   <pic:nvPicPr>
-                    <pic:cNvPr descr="index_files/figure-docx/bes_disoccup_m_f_plot-1.png" id="100" name="Picture"/>
+                    <pic:cNvPr descr="index_files/figure-docx/bes_disoccup_m_f_plot-1.png" id="104" name="Picture"/>
                     <pic:cNvPicPr>
                       <a:picLocks noChangeArrowheads="1" noChangeAspect="1"/>
                     </pic:cNvPicPr>
                   </pic:nvPicPr>
                   <pic:blipFill>
-                    <a:blip r:embed="rId98"/>
+                    <a:blip r:embed="rId102"/>
                     <a:stretch>
                       <a:fillRect/>
                     </a:stretch>
@@ -7842,9 +7963,9 @@
         </w:drawing>
       </w:r>
     </w:p>
-    <w:bookmarkEnd w:id="101"/>
-    <w:bookmarkEnd w:id="102"/>
-    <w:bookmarkStart w:id="109" w:name="formazione-e-neet"/>
+    <w:bookmarkEnd w:id="105"/>
+    <w:bookmarkEnd w:id="106"/>
+    <w:bookmarkStart w:id="113" w:name="formazione-e-neet"/>
     <w:p>
       <w:pPr>
         <w:pStyle w:val="Heading3"/>
@@ -7881,18 +8002,18 @@
           <wp:inline>
             <wp:extent cx="5334000" cy="4000500"/>
             <wp:effectExtent b="0" l="0" r="0" t="0"/>
-            <wp:docPr descr="" title="" id="104" name="Picture"/>
+            <wp:docPr descr="" title="" id="108" name="Picture"/>
             <a:graphic>
               <a:graphicData uri="http://schemas.openxmlformats.org/drawingml/2006/picture">
                 <pic:pic>
                   <pic:nvPicPr>
-                    <pic:cNvPr descr="index_files/figure-docx/bes_neet_plot-1.png" id="105" name="Picture"/>
+                    <pic:cNvPr descr="index_files/figure-docx/bes_neet_plot-1.png" id="109" name="Picture"/>
                     <pic:cNvPicPr>
                       <a:picLocks noChangeArrowheads="1" noChangeAspect="1"/>
                     </pic:cNvPicPr>
                   </pic:nvPicPr>
                   <pic:blipFill>
-                    <a:blip r:embed="rId103"/>
+                    <a:blip r:embed="rId107"/>
                     <a:stretch>
                       <a:fillRect/>
                     </a:stretch>
@@ -7928,18 +8049,18 @@
           <wp:inline>
             <wp:extent cx="5334000" cy="4000500"/>
             <wp:effectExtent b="0" l="0" r="0" t="0"/>
-            <wp:docPr descr="" title="" id="107" name="Picture"/>
+            <wp:docPr descr="" title="" id="111" name="Picture"/>
             <a:graphic>
               <a:graphicData uri="http://schemas.openxmlformats.org/drawingml/2006/picture">
                 <pic:pic>
                   <pic:nvPicPr>
-                    <pic:cNvPr descr="index_files/figure-docx/bes_formaz_plot-1.png" id="108" name="Picture"/>
+                    <pic:cNvPr descr="index_files/figure-docx/bes_formaz_plot-1.png" id="112" name="Picture"/>
                     <pic:cNvPicPr>
                       <a:picLocks noChangeArrowheads="1" noChangeAspect="1"/>
                     </pic:cNvPicPr>
                   </pic:nvPicPr>
                   <pic:blipFill>
-                    <a:blip r:embed="rId106"/>
+                    <a:blip r:embed="rId110"/>
                     <a:stretch>
                       <a:fillRect/>
                     </a:stretch>
@@ -7966,10 +8087,10 @@
         </w:drawing>
       </w:r>
     </w:p>
-    <w:bookmarkEnd w:id="109"/>
-    <w:bookmarkEnd w:id="110"/>
-    <w:bookmarkEnd w:id="111"/>
-    <w:bookmarkStart w:id="112" w:name="section-1"/>
+    <w:bookmarkEnd w:id="113"/>
+    <w:bookmarkEnd w:id="114"/>
+    <w:bookmarkEnd w:id="115"/>
+    <w:bookmarkStart w:id="116" w:name="section-1"/>
     <w:p>
       <w:pPr>
         <w:pStyle w:val="Heading1"/>
@@ -7978,8 +8099,8 @@
         <w:t xml:space="preserve">____</w:t>
       </w:r>
     </w:p>
-    <w:bookmarkEnd w:id="112"/>
-    <w:bookmarkStart w:id="116" w:name="X17434f237ff556da21455e8213a41950b5959d0"/>
+    <w:bookmarkEnd w:id="116"/>
+    <w:bookmarkStart w:id="120" w:name="X17434f237ff556da21455e8213a41950b5959d0"/>
     <w:p>
       <w:pPr>
         <w:pStyle w:val="Heading1"/>
@@ -7999,7 +8120,7 @@
         <w:t xml:space="preserve">, supportando una nuova visione strategiica e valorizzando sinergia tra obiettivi. [DPP 2025]”</w:t>
       </w:r>
     </w:p>
-    <w:bookmarkStart w:id="115" w:name="qualità-dei-servizi-e-ambiente"/>
+    <w:bookmarkStart w:id="119" w:name="qualità-dei-servizi-e-ambiente"/>
     <w:p>
       <w:pPr>
         <w:pStyle w:val="Heading2"/>
@@ -8016,7 +8137,7 @@
         <w:t xml:space="preserve">QUI HO MESSO SOLO LE TABELLE PERCHE’ SONO DATI UN PO’ DISPARATI: SI POTREBBE FARSI AIUTARE E FARE DELLE INFOGRAFICHE UN PO’ PIÙ INTERESSANTI…</w:t>
       </w:r>
     </w:p>
-    <w:bookmarkStart w:id="113" w:name="tbl-servizi-sul-territorio"/>
+    <w:bookmarkStart w:id="117" w:name="tbl-servizi-sul-territorio"/>
     <w:p>
       <w:pPr>
         <w:pStyle w:val="Heading3"/>
@@ -18693,8 +18814,8 @@
         </w:tc>
       </w:tr>
     </w:tbl>
-    <w:bookmarkEnd w:id="113"/>
-    <w:bookmarkStart w:id="114" w:name="tbl-ambiente"/>
+    <w:bookmarkEnd w:id="117"/>
+    <w:bookmarkStart w:id="118" w:name="tbl-ambiente"/>
     <w:p>
       <w:pPr>
         <w:pStyle w:val="Heading3"/>
@@ -27978,10 +28099,10 @@
         <w:br w:type="page"/>
       </w:r>
     </w:p>
-    <w:bookmarkEnd w:id="114"/>
-    <w:bookmarkEnd w:id="115"/>
-    <w:bookmarkEnd w:id="116"/>
-    <w:bookmarkStart w:id="117" w:name="section-2"/>
+    <w:bookmarkEnd w:id="118"/>
+    <w:bookmarkEnd w:id="119"/>
+    <w:bookmarkEnd w:id="120"/>
+    <w:bookmarkStart w:id="121" w:name="section-2"/>
     <w:p>
       <w:pPr>
         <w:pStyle w:val="Heading1"/>
@@ -27990,8 +28111,8 @@
         <w:t xml:space="preserve">____</w:t>
       </w:r>
     </w:p>
-    <w:bookmarkEnd w:id="117"/>
-    <w:bookmarkStart w:id="129" w:name="X489f9b6d5a5b4aa949a31c95b266d11742852c4"/>
+    <w:bookmarkEnd w:id="121"/>
+    <w:bookmarkStart w:id="133" w:name="X489f9b6d5a5b4aa949a31c95b266d11742852c4"/>
     <w:p>
       <w:pPr>
         <w:pStyle w:val="Heading1"/>
@@ -28000,7 +28121,7 @@
         <w:t xml:space="preserve">AMBITO INTERVENTO: Valorizzare l’innovazione</w:t>
       </w:r>
     </w:p>
-    <w:bookmarkStart w:id="124" w:name="propensione-alla-brevettazione"/>
+    <w:bookmarkStart w:id="128" w:name="propensione-alla-brevettazione"/>
     <w:p>
       <w:pPr>
         <w:pStyle w:val="Heading3"/>
@@ -28140,18 +28261,18 @@
                 <wp:inline>
                   <wp:extent cx="5334000" cy="3720439"/>
                   <wp:effectExtent b="0" l="0" r="0" t="0"/>
-                  <wp:docPr descr="1)" title="" id="119" name="Picture"/>
+                  <wp:docPr descr="1)" title="" id="123" name="Picture"/>
                   <a:graphic>
                     <a:graphicData uri="http://schemas.openxmlformats.org/drawingml/2006/picture">
                       <pic:pic>
                         <pic:nvPicPr>
-                          <pic:cNvPr descr="data_in/eurostat_brevetti/brevetti.png" id="120" name="Picture"/>
+                          <pic:cNvPr descr="data_in/eurostat_brevetti/brevetti.png" id="124" name="Picture"/>
                           <pic:cNvPicPr>
                             <a:picLocks noChangeArrowheads="1" noChangeAspect="1"/>
                           </pic:cNvPicPr>
                         </pic:nvPicPr>
                         <pic:blipFill>
-                          <a:blip r:embed="rId118"/>
+                          <a:blip r:embed="rId122"/>
                           <a:stretch>
                             <a:fillRect/>
                           </a:stretch>
@@ -28185,18 +28306,18 @@
                 <wp:inline>
                   <wp:extent cx="5334000" cy="3342251"/>
                   <wp:effectExtent b="0" l="0" r="0" t="0"/>
-                  <wp:docPr descr="2)" title="" id="122" name="Picture"/>
+                  <wp:docPr descr="2)" title="" id="126" name="Picture"/>
                   <a:graphic>
                     <a:graphicData uri="http://schemas.openxmlformats.org/drawingml/2006/picture">
                       <pic:pic>
                         <pic:nvPicPr>
-                          <pic:cNvPr descr="data_in/eurostat_brevetti/brevetti_pop.png" id="123" name="Picture"/>
+                          <pic:cNvPr descr="data_in/eurostat_brevetti/brevetti_pop.png" id="127" name="Picture"/>
                           <pic:cNvPicPr>
                             <a:picLocks noChangeArrowheads="1" noChangeAspect="1"/>
                           </pic:cNvPicPr>
                         </pic:nvPicPr>
                         <pic:blipFill>
-                          <a:blip r:embed="rId121"/>
+                          <a:blip r:embed="rId125"/>
                           <a:stretch>
                             <a:fillRect/>
                           </a:stretch>
@@ -28226,8 +28347,8 @@
         </w:tc>
       </w:tr>
     </w:tbl>
-    <w:bookmarkEnd w:id="124"/>
-    <w:bookmarkStart w:id="128" w:name="Xa71a79528b1b5d68dca92dacbbef8e4061af517"/>
+    <w:bookmarkEnd w:id="128"/>
+    <w:bookmarkStart w:id="132" w:name="Xa71a79528b1b5d68dca92dacbbef8e4061af517"/>
     <w:p>
       <w:pPr>
         <w:pStyle w:val="Heading3"/>
@@ -28273,7 +28394,7 @@
         <w:t xml:space="preserve">(RE-R Agenda Digitale dell’Emilia-Romagna 2025)</w:t>
       </w:r>
       <w:r>
-        <w:t xml:space="preserve">. Questo strumento (realizzato realizzato nell’ambito delle attività di ADER, Agenda Digitale dell’Emilia-Romagna) consente l’analisi di 4 dimensioni di sviluppo principali che, a loro volta, combinano molti indicatori:</w:t>
+        <w:t xml:space="preserve">. Questo strumento (realizzato nell’ambito delle attività di ADER, Agenda Digitale dell’Emilia-Romagna) consente l’analisi di 4 dimensioni di sviluppo principali che, a loro volta, combinano molti indicatori:</w:t>
       </w:r>
     </w:p>
     <w:p>
@@ -28281,7 +28402,7 @@
         <w:pStyle w:val="Compact"/>
         <w:numPr>
           <w:ilvl w:val="0"/>
-          <w:numId w:val="1007"/>
+          <w:numId w:val="1008"/>
         </w:numPr>
       </w:pPr>
       <w:r>
@@ -28308,7 +28429,7 @@
         <w:pStyle w:val="Compact"/>
         <w:numPr>
           <w:ilvl w:val="0"/>
-          <w:numId w:val="1007"/>
+          <w:numId w:val="1008"/>
         </w:numPr>
       </w:pPr>
       <w:r>
@@ -28329,7 +28450,7 @@
         <w:pStyle w:val="Compact"/>
         <w:numPr>
           <w:ilvl w:val="0"/>
-          <w:numId w:val="1007"/>
+          <w:numId w:val="1008"/>
         </w:numPr>
       </w:pPr>
       <w:r>
@@ -28356,7 +28477,7 @@
         <w:pStyle w:val="Compact"/>
         <w:numPr>
           <w:ilvl w:val="0"/>
-          <w:numId w:val="1007"/>
+          <w:numId w:val="1008"/>
         </w:numPr>
       </w:pPr>
       <w:r>
@@ -28397,18 +28518,18 @@
           <wp:inline>
             <wp:extent cx="5334000" cy="3036934"/>
             <wp:effectExtent b="0" l="0" r="0" t="0"/>
-            <wp:docPr descr="" title="" id="126" name="Picture"/>
+            <wp:docPr descr="" title="" id="130" name="Picture"/>
             <a:graphic>
               <a:graphicData uri="http://schemas.openxmlformats.org/drawingml/2006/picture">
                 <pic:pic>
                   <pic:nvPicPr>
-                    <pic:cNvPr descr="data_in/desier/desier_parma_PR_ER.png" id="127" name="Picture"/>
+                    <pic:cNvPr descr="data_in/desier/desier_parma_PR_ER.png" id="131" name="Picture"/>
                     <pic:cNvPicPr>
                       <a:picLocks noChangeArrowheads="1" noChangeAspect="1"/>
                     </pic:cNvPicPr>
                   </pic:nvPicPr>
                   <pic:blipFill>
-                    <a:blip r:embed="rId125"/>
+                    <a:blip r:embed="rId129"/>
                     <a:stretch>
                       <a:fillRect/>
                     </a:stretch>
@@ -28435,9 +28556,9 @@
         </w:drawing>
       </w:r>
     </w:p>
-    <w:bookmarkEnd w:id="128"/>
-    <w:bookmarkEnd w:id="129"/>
-    <w:bookmarkStart w:id="146" w:name="fonti"/>
+    <w:bookmarkEnd w:id="132"/>
+    <w:bookmarkEnd w:id="133"/>
+    <w:bookmarkStart w:id="152" w:name="fonti"/>
     <w:p>
       <w:pPr>
         <w:pStyle w:val="Heading1"/>
@@ -28446,8 +28567,8 @@
         <w:t xml:space="preserve">Fonti</w:t>
       </w:r>
     </w:p>
-    <w:bookmarkStart w:id="145" w:name="refs"/>
-    <w:bookmarkStart w:id="130" w:name="ref-art-erBrevettiDellEuropeanPatent2025"/>
+    <w:bookmarkStart w:id="151" w:name="refs"/>
+    <w:bookmarkStart w:id="134" w:name="ref-art-erBrevettiDellEuropeanPatent2025"/>
     <w:p>
       <w:pPr>
         <w:pStyle w:val="Bibliography"/>
@@ -28483,8 +28604,8 @@
         <w:t xml:space="preserve">.</w:t>
       </w:r>
     </w:p>
-    <w:bookmarkEnd w:id="130"/>
-    <w:bookmarkStart w:id="132" w:name="ref-eurostatPatentApplicationsEPO2024"/>
+    <w:bookmarkEnd w:id="134"/>
+    <w:bookmarkStart w:id="136" w:name="ref-eurostatPatentApplicationsEPO2024"/>
     <w:p>
       <w:pPr>
         <w:pStyle w:val="Bibliography"/>
@@ -28516,7 +28637,7 @@
       <w:r>
         <w:t xml:space="preserve"> </w:t>
       </w:r>
-      <w:hyperlink r:id="rId131">
+      <w:hyperlink r:id="rId135">
         <w:r>
           <w:rPr>
             <w:rStyle w:val="Hyperlink"/>
@@ -28528,19 +28649,52 @@
         <w:t xml:space="preserve">.</w:t>
       </w:r>
     </w:p>
-    <w:bookmarkEnd w:id="132"/>
-    <w:bookmarkStart w:id="134" w:name="ref-istatDemoDemografiaCifre2025"/>
+    <w:bookmarkEnd w:id="136"/>
+    <w:bookmarkStart w:id="138" w:name="ref-istatCondizioniDiSalute2022"/>
     <w:p>
       <w:pPr>
         <w:pStyle w:val="Bibliography"/>
       </w:pPr>
       <w:r>
-        <w:t xml:space="preserve">Istat. 2025a.</w:t>
+        <w:t xml:space="preserve">Istat. 2022.</w:t>
       </w:r>
       <w:r>
         <w:t xml:space="preserve"> </w:t>
       </w:r>
       <w:r>
+        <w:t xml:space="preserve">«Le condizioni di salute della popolazione anziana in Italia - Anno 2019»</w:t>
+      </w:r>
+      <w:r>
+        <w:t xml:space="preserve">.</w:t>
+      </w:r>
+      <w:r>
+        <w:t xml:space="preserve"> </w:t>
+      </w:r>
+      <w:hyperlink r:id="rId137">
+        <w:r>
+          <w:rPr>
+            <w:rStyle w:val="Hyperlink"/>
+          </w:rPr>
+          <w:t xml:space="preserve">https://www.istat.it/tavole-di-dati/condizioni-di-salute-e-ricorso-ai-servizi-sanitari-in-italia-e-nellunione-europea-indagine-ehis-2019/</w:t>
+        </w:r>
+      </w:hyperlink>
+      <w:r>
+        <w:t xml:space="preserve">.</w:t>
+      </w:r>
+    </w:p>
+    <w:bookmarkEnd w:id="138"/>
+    <w:bookmarkStart w:id="140" w:name="ref-istatDemoDemografiaCifre2025"/>
+    <w:p>
+      <w:pPr>
+        <w:pStyle w:val="Bibliography"/>
+      </w:pPr>
+      <w:r>
+        <w:t xml:space="preserve">———. 2025a.</w:t>
+      </w:r>
+      <w:r>
+        <w:t xml:space="preserve"> </w:t>
+      </w:r>
+      <w:r>
         <w:t xml:space="preserve">«Demo -</w:t>
       </w:r>
       <w:r>
@@ -28561,7 +28715,7 @@
       <w:r>
         <w:t xml:space="preserve"> </w:t>
       </w:r>
-      <w:hyperlink r:id="rId133">
+      <w:hyperlink r:id="rId139">
         <w:r>
           <w:rPr>
             <w:rStyle w:val="Hyperlink"/>
@@ -28573,8 +28727,8 @@
         <w:t xml:space="preserve">.</w:t>
       </w:r>
     </w:p>
-    <w:bookmarkEnd w:id="134"/>
-    <w:bookmarkStart w:id="136" w:name="ref-istatConfiniUnitaAmministrative2025a"/>
+    <w:bookmarkEnd w:id="140"/>
+    <w:bookmarkStart w:id="142" w:name="ref-istatConfiniUnitaAmministrative2025a"/>
     <w:p>
       <w:pPr>
         <w:pStyle w:val="Bibliography"/>
@@ -28594,7 +28748,7 @@
       <w:r>
         <w:t xml:space="preserve"> </w:t>
       </w:r>
-      <w:hyperlink r:id="rId135">
+      <w:hyperlink r:id="rId141">
         <w:r>
           <w:rPr>
             <w:rStyle w:val="Hyperlink"/>
@@ -28606,8 +28760,8 @@
         <w:t xml:space="preserve">.</w:t>
       </w:r>
     </w:p>
-    <w:bookmarkEnd w:id="136"/>
-    <w:bookmarkStart w:id="138" w:name="ref-istatBesTerritoriEmilia2025a"/>
+    <w:bookmarkEnd w:id="142"/>
+    <w:bookmarkStart w:id="144" w:name="ref-istatBesTerritoriEmilia2025a"/>
     <w:p>
       <w:pPr>
         <w:pStyle w:val="Bibliography"/>
@@ -28651,7 +28805,7 @@
       <w:r>
         <w:t xml:space="preserve"> </w:t>
       </w:r>
-      <w:hyperlink r:id="rId137">
+      <w:hyperlink r:id="rId143">
         <w:r>
           <w:rPr>
             <w:rStyle w:val="Hyperlink"/>
@@ -28663,8 +28817,8 @@
         <w:t xml:space="preserve">.</w:t>
       </w:r>
     </w:p>
-    <w:bookmarkEnd w:id="138"/>
-    <w:bookmarkStart w:id="140" w:name="X2dad0e74d362bae1b9ea60c8681a301ca68adb2"/>
+    <w:bookmarkEnd w:id="144"/>
+    <w:bookmarkStart w:id="146" w:name="X2dad0e74d362bae1b9ea60c8681a301ca68adb2"/>
     <w:p>
       <w:pPr>
         <w:pStyle w:val="Bibliography"/>
@@ -28684,7 +28838,7 @@
       <w:r>
         <w:t xml:space="preserve"> </w:t>
       </w:r>
-      <w:hyperlink r:id="rId139">
+      <w:hyperlink r:id="rId145">
         <w:r>
           <w:rPr>
             <w:rStyle w:val="Hyperlink"/>
@@ -28696,8 +28850,8 @@
         <w:t xml:space="preserve">.</w:t>
       </w:r>
     </w:p>
-    <w:bookmarkEnd w:id="140"/>
-    <w:bookmarkStart w:id="142" w:name="X55cb39cda2c3893020072fedbd198e0f73c2abf"/>
+    <w:bookmarkEnd w:id="146"/>
+    <w:bookmarkStart w:id="148" w:name="X55cb39cda2c3893020072fedbd198e0f73c2abf"/>
     <w:p>
       <w:pPr>
         <w:pStyle w:val="Bibliography"/>
@@ -28717,7 +28871,7 @@
       <w:r>
         <w:t xml:space="preserve"> </w:t>
       </w:r>
-      <w:hyperlink r:id="rId141">
+      <w:hyperlink r:id="rId147">
         <w:r>
           <w:rPr>
             <w:rStyle w:val="Hyperlink"/>
@@ -28729,8 +28883,8 @@
         <w:t xml:space="preserve">.</w:t>
       </w:r>
     </w:p>
-    <w:bookmarkEnd w:id="142"/>
-    <w:bookmarkStart w:id="144" w:name="X51c05c0937d28e07205812bde6bdc824159d2ba"/>
+    <w:bookmarkEnd w:id="148"/>
+    <w:bookmarkStart w:id="150" w:name="X51c05c0937d28e07205812bde6bdc824159d2ba"/>
     <w:p>
       <w:pPr>
         <w:pStyle w:val="Bibliography"/>
@@ -28750,7 +28904,7 @@
       <w:r>
         <w:t xml:space="preserve"> </w:t>
       </w:r>
-      <w:hyperlink r:id="rId143">
+      <w:hyperlink r:id="rId149">
         <w:r>
           <w:rPr>
             <w:rStyle w:val="Hyperlink"/>
@@ -28762,9 +28916,9 @@
         <w:t xml:space="preserve">.</w:t>
       </w:r>
     </w:p>
-    <w:bookmarkEnd w:id="144"/>
-    <w:bookmarkEnd w:id="145"/>
-    <w:bookmarkEnd w:id="146"/>
+    <w:bookmarkEnd w:id="150"/>
+    <w:bookmarkEnd w:id="151"/>
+    <w:bookmarkEnd w:id="152"/>
     <w:sectPr>
       <w:footnotePr>
         <w:numRestart w:val="eachSect"/>
@@ -29000,6 +29154,9 @@
     <w:abstractNumId w:val="991"/>
   </w:num>
   <w:num w:numId="1007">
+    <w:abstractNumId w:val="991"/>
+  </w:num>
+  <w:num w:numId="1008">
     <w:abstractNumId w:val="991"/>
   </w:num>
 </w:numbering>

</xml_diff>

<commit_message>
last little upd BES
</commit_message>
<xml_diff>
--- a/index.docx
+++ b/index.docx
@@ -23,7 +23,7 @@
         <w:pStyle w:val="Date"/>
       </w:pPr>
       <w:r>
-        <w:t xml:space="preserve">11-febbraio-2026</w:t>
+        <w:t xml:space="preserve">12-febbraio-2026</w:t>
       </w:r>
     </w:p>
     <w:bookmarkStart w:id="20" w:name="importazione-dati"/>
@@ -193,7 +193,7 @@
       </w:r>
     </w:p>
     <w:bookmarkEnd w:id="20"/>
-    <w:bookmarkStart w:id="85" w:name="priorità-ridurre-le-disuguaglianze"/>
+    <w:bookmarkStart w:id="89" w:name="priorità-ridurre-le-disuguaglianze"/>
     <w:p>
       <w:pPr>
         <w:pStyle w:val="Heading1"/>
@@ -2512,7 +2512,7 @@
     </w:p>
     <w:bookmarkEnd w:id="44"/>
     <w:bookmarkEnd w:id="45"/>
-    <w:bookmarkStart w:id="84" w:name="trend-demografici-a-confronto"/>
+    <w:bookmarkStart w:id="88" w:name="trend-demografici-a-confronto"/>
     <w:p>
       <w:pPr>
         <w:pStyle w:val="Heading2"/>
@@ -2966,26 +2966,18 @@
       </w:r>
     </w:p>
     <w:bookmarkEnd w:id="76"/>
-    <w:bookmarkStart w:id="83" w:name="mobilità-dei-laureati"/>
+    <w:bookmarkStart w:id="80" w:name="diplomati-e-laureati-in-emilia-romagna"/>
     <w:p>
       <w:pPr>
         <w:pStyle w:val="Heading3"/>
       </w:pPr>
       <w:r>
-        <w:t xml:space="preserve">Mobilità dei laureati</w:t>
+        <w:t xml:space="preserve">Diplomati e laureati in Emilia-Romagna</w:t>
       </w:r>
     </w:p>
     <w:p>
       <w:pPr>
         <w:pStyle w:val="FirstParagraph"/>
-      </w:pPr>
-      <w:r>
-        <w:t xml:space="preserve">Parma ed Emilia-Romagna registrano saldi migratori positivi dei laureati (attrazione netta), mentre l’Italia nel complesso perde laureati verso l’estero, con tassi negativi stabilmente tra -2 e -8 per mille nel periodo 2019-2023.</w:t>
-      </w:r>
-    </w:p>
-    <w:p>
-      <w:pPr>
-        <w:pStyle w:val="BodyText"/>
       </w:pPr>
       <w:r>
         <w:drawing>
@@ -2997,7 +2989,7 @@
               <a:graphicData uri="http://schemas.openxmlformats.org/drawingml/2006/picture">
                 <pic:pic>
                   <pic:nvPicPr>
-                    <pic:cNvPr descr="index_files/figure-docx/bes_mob_lau_plot-1.png" id="79" name="Picture"/>
+                    <pic:cNvPr descr="index_files/figure-docx/bes_dip_lau_plot-1.png" id="79" name="Picture"/>
                     <pic:cNvPicPr>
                       <a:picLocks noChangeArrowheads="1" noChangeAspect="1"/>
                     </pic:cNvPicPr>
@@ -3030,6 +3022,71 @@
         </w:drawing>
       </w:r>
     </w:p>
+    <w:bookmarkEnd w:id="80"/>
+    <w:bookmarkStart w:id="87" w:name="mobilità-dei-laureati"/>
+    <w:p>
+      <w:pPr>
+        <w:pStyle w:val="Heading3"/>
+      </w:pPr>
+      <w:r>
+        <w:t xml:space="preserve">Mobilità dei laureati</w:t>
+      </w:r>
+    </w:p>
+    <w:p>
+      <w:pPr>
+        <w:pStyle w:val="FirstParagraph"/>
+      </w:pPr>
+      <w:r>
+        <w:t xml:space="preserve">Parma ed Emilia-Romagna registrano saldi migratori positivi dei laureati (attrazione netta), mentre l’Italia nel complesso perde laureati verso l’estero, con tassi negativi stabilmente tra -2 e -8 per mille nel periodo 2019-2023.</w:t>
+      </w:r>
+    </w:p>
+    <w:p>
+      <w:pPr>
+        <w:pStyle w:val="BodyText"/>
+      </w:pPr>
+      <w:r>
+        <w:drawing>
+          <wp:inline>
+            <wp:extent cx="5334000" cy="4000500"/>
+            <wp:effectExtent b="0" l="0" r="0" t="0"/>
+            <wp:docPr descr="" title="" id="82" name="Picture"/>
+            <a:graphic>
+              <a:graphicData uri="http://schemas.openxmlformats.org/drawingml/2006/picture">
+                <pic:pic>
+                  <pic:nvPicPr>
+                    <pic:cNvPr descr="index_files/figure-docx/bes_mob_lau_plot-1.png" id="83" name="Picture"/>
+                    <pic:cNvPicPr>
+                      <a:picLocks noChangeArrowheads="1" noChangeAspect="1"/>
+                    </pic:cNvPicPr>
+                  </pic:nvPicPr>
+                  <pic:blipFill>
+                    <a:blip r:embed="rId81"/>
+                    <a:stretch>
+                      <a:fillRect/>
+                    </a:stretch>
+                  </pic:blipFill>
+                  <pic:spPr bwMode="auto">
+                    <a:xfrm>
+                      <a:off x="0" y="0"/>
+                      <a:ext cx="5334000" cy="4000500"/>
+                    </a:xfrm>
+                    <a:prstGeom prst="rect">
+                      <a:avLst/>
+                    </a:prstGeom>
+                    <a:noFill/>
+                    <a:ln w="9525">
+                      <a:noFill/>
+                      <a:headEnd/>
+                      <a:tailEnd/>
+                    </a:ln>
+                  </pic:spPr>
+                </pic:pic>
+              </a:graphicData>
+            </a:graphic>
+          </wp:inline>
+        </w:drawing>
+      </w:r>
+    </w:p>
     <w:tbl>
       <w:tblPr>
         <w:tblStyle w:val="Table"/>
@@ -3072,18 +3129,18 @@
                 <wp:inline>
                   <wp:extent cx="152400" cy="152400"/>
                   <wp:effectExtent b="0" l="0" r="0" t="0"/>
-                  <wp:docPr descr="" title="" id="81" name="Picture"/>
+                  <wp:docPr descr="" title="" id="85" name="Picture"/>
                   <a:graphic>
                     <a:graphicData uri="http://schemas.openxmlformats.org/drawingml/2006/picture">
                       <pic:pic>
                         <pic:nvPicPr>
-                          <pic:cNvPr descr="/Applications/RStudio.app/Contents/Resources/app/quarto/share/formats/docx/note.png" id="82" name="Picture"/>
+                          <pic:cNvPr descr="/Applications/RStudio.app/Contents/Resources/app/quarto/share/formats/docx/note.png" id="86" name="Picture"/>
                           <pic:cNvPicPr>
                             <a:picLocks noChangeArrowheads="1" noChangeAspect="1"/>
                           </pic:cNvPicPr>
                         </pic:nvPicPr>
                         <pic:blipFill>
-                          <a:blip r:embed="rId80"/>
+                          <a:blip r:embed="rId84"/>
                           <a:stretch>
                             <a:fillRect/>
                           </a:stretch>
@@ -3161,10 +3218,10 @@
         <w:br w:type="page"/>
       </w:r>
     </w:p>
-    <w:bookmarkEnd w:id="83"/>
-    <w:bookmarkEnd w:id="84"/>
-    <w:bookmarkEnd w:id="85"/>
-    <w:bookmarkStart w:id="86" w:name="section"/>
+    <w:bookmarkEnd w:id="87"/>
+    <w:bookmarkEnd w:id="88"/>
+    <w:bookmarkEnd w:id="89"/>
+    <w:bookmarkStart w:id="90" w:name="section"/>
     <w:p>
       <w:pPr>
         <w:pStyle w:val="Heading1"/>
@@ -3173,8 +3230,8 @@
         <w:t xml:space="preserve">____</w:t>
       </w:r>
     </w:p>
-    <w:bookmarkEnd w:id="86"/>
-    <w:bookmarkStart w:id="122" w:name="X9c6152cf08ae4e10f8c1d05efafc6af7458f9d7"/>
+    <w:bookmarkEnd w:id="90"/>
+    <w:bookmarkStart w:id="126" w:name="X9c6152cf08ae4e10f8c1d05efafc6af7458f9d7"/>
     <w:p>
       <w:pPr>
         <w:pStyle w:val="Heading1"/>
@@ -3194,7 +3251,7 @@
         <w:t xml:space="preserve">come crescita, formazione innovazione, e come messa in rete del proprio contributo. [DPP 2025]”</w:t>
       </w:r>
     </w:p>
-    <w:bookmarkStart w:id="121" w:name="benessere-economico-delle-famiglie"/>
+    <w:bookmarkStart w:id="125" w:name="benessere-economico-delle-famiglie"/>
     <w:p>
       <w:pPr>
         <w:pStyle w:val="Heading2"/>
@@ -3244,7 +3301,7 @@
         <w:t xml:space="preserve">]</w:t>
       </w:r>
     </w:p>
-    <w:bookmarkStart w:id="93" w:name="reddito-medio-da-lavoro-e-pensione"/>
+    <w:bookmarkStart w:id="97" w:name="reddito-medio-da-lavoro-e-pensione"/>
     <w:p>
       <w:pPr>
         <w:pStyle w:val="Heading3"/>
@@ -3318,18 +3375,18 @@
                 <wp:inline>
                   <wp:extent cx="152400" cy="152400"/>
                   <wp:effectExtent b="0" l="0" r="0" t="0"/>
-                  <wp:docPr descr="" title="" id="87" name="Picture"/>
+                  <wp:docPr descr="" title="" id="91" name="Picture"/>
                   <a:graphic>
                     <a:graphicData uri="http://schemas.openxmlformats.org/drawingml/2006/picture">
                       <pic:pic>
                         <pic:nvPicPr>
-                          <pic:cNvPr descr="/Applications/RStudio.app/Contents/Resources/app/quarto/share/formats/docx/note.png" id="88" name="Picture"/>
+                          <pic:cNvPr descr="/Applications/RStudio.app/Contents/Resources/app/quarto/share/formats/docx/note.png" id="92" name="Picture"/>
                           <pic:cNvPicPr>
                             <a:picLocks noChangeArrowheads="1" noChangeAspect="1"/>
                           </pic:cNvPicPr>
                         </pic:nvPicPr>
                         <pic:blipFill>
-                          <a:blip r:embed="rId80"/>
+                          <a:blip r:embed="rId84"/>
                           <a:stretch>
                             <a:fillRect/>
                           </a:stretch>
@@ -3489,7 +3546,7 @@
             <w:r>
               <w:t xml:space="preserve"> </w:t>
             </w:r>
-            <w:hyperlink r:id="rId89">
+            <w:hyperlink r:id="rId93">
               <w:r>
                 <w:rPr>
                   <w:rStyle w:val="Hyperlink"/>
@@ -3513,18 +3570,18 @@
           <wp:inline>
             <wp:extent cx="5334000" cy="4000500"/>
             <wp:effectExtent b="0" l="0" r="0" t="0"/>
-            <wp:docPr descr="" title="" id="91" name="Picture"/>
+            <wp:docPr descr="" title="" id="95" name="Picture"/>
             <a:graphic>
               <a:graphicData uri="http://schemas.openxmlformats.org/drawingml/2006/picture">
                 <pic:pic>
                   <pic:nvPicPr>
-                    <pic:cNvPr descr="index_files/figure-docx/bes_reddito_barplot-1.png" id="92" name="Picture"/>
+                    <pic:cNvPr descr="index_files/figure-docx/bes_reddito_barplot-1.png" id="96" name="Picture"/>
                     <pic:cNvPicPr>
                       <a:picLocks noChangeArrowheads="1" noChangeAspect="1"/>
                     </pic:cNvPicPr>
                   </pic:nvPicPr>
                   <pic:blipFill>
-                    <a:blip r:embed="rId90"/>
+                    <a:blip r:embed="rId94"/>
                     <a:stretch>
                       <a:fillRect/>
                     </a:stretch>
@@ -3551,8 +3608,8 @@
         </w:drawing>
       </w:r>
     </w:p>
-    <w:bookmarkEnd w:id="93"/>
-    <w:bookmarkStart w:id="95" w:name="tbl-reddito-medio-disponibile-pro-capite"/>
+    <w:bookmarkEnd w:id="97"/>
+    <w:bookmarkStart w:id="99" w:name="tbl-reddito-medio-disponibile-pro-capite"/>
     <w:p>
       <w:pPr>
         <w:pStyle w:val="Heading3"/>
@@ -6396,7 +6453,7 @@
         </w:tc>
       </w:tr>
     </w:tbl>
-    <w:bookmarkStart w:id="94" w:name="maschi-e-femmine"/>
+    <w:bookmarkStart w:id="98" w:name="maschi-e-femmine"/>
     <w:p>
       <w:pPr>
         <w:pStyle w:val="Heading4"/>
@@ -7598,9 +7655,9 @@
         </w:tc>
       </w:tr>
     </w:tbl>
-    <w:bookmarkEnd w:id="94"/>
-    <w:bookmarkEnd w:id="95"/>
-    <w:bookmarkStart w:id="103" w:name="occupazione"/>
+    <w:bookmarkEnd w:id="98"/>
+    <w:bookmarkEnd w:id="99"/>
+    <w:bookmarkStart w:id="107" w:name="occupazione"/>
     <w:p>
       <w:pPr>
         <w:pStyle w:val="Heading3"/>
@@ -7634,18 +7691,18 @@
           <wp:inline>
             <wp:extent cx="5334000" cy="4000500"/>
             <wp:effectExtent b="0" l="0" r="0" t="0"/>
-            <wp:docPr descr="" title="" id="97" name="Picture"/>
+            <wp:docPr descr="" title="" id="101" name="Picture"/>
             <a:graphic>
               <a:graphicData uri="http://schemas.openxmlformats.org/drawingml/2006/picture">
                 <pic:pic>
                   <pic:nvPicPr>
-                    <pic:cNvPr descr="index_files/figure-docx/bes_occup_plot-1.png" id="98" name="Picture"/>
+                    <pic:cNvPr descr="index_files/figure-docx/bes_occup_plot-1.png" id="102" name="Picture"/>
                     <pic:cNvPicPr>
                       <a:picLocks noChangeArrowheads="1" noChangeAspect="1"/>
                     </pic:cNvPicPr>
                   </pic:nvPicPr>
                   <pic:blipFill>
-                    <a:blip r:embed="rId96"/>
+                    <a:blip r:embed="rId100"/>
                     <a:stretch>
                       <a:fillRect/>
                     </a:stretch>
@@ -7672,7 +7729,7 @@
         </w:drawing>
       </w:r>
     </w:p>
-    <w:bookmarkStart w:id="102" w:name="maschi-e-femmine-2024"/>
+    <w:bookmarkStart w:id="106" w:name="maschi-e-femmine-2024"/>
     <w:p>
       <w:pPr>
         <w:pStyle w:val="Heading4"/>
@@ -7690,18 +7747,18 @@
           <wp:inline>
             <wp:extent cx="5334000" cy="4000500"/>
             <wp:effectExtent b="0" l="0" r="0" t="0"/>
-            <wp:docPr descr="" title="" id="100" name="Picture"/>
+            <wp:docPr descr="" title="" id="104" name="Picture"/>
             <a:graphic>
               <a:graphicData uri="http://schemas.openxmlformats.org/drawingml/2006/picture">
                 <pic:pic>
                   <pic:nvPicPr>
-                    <pic:cNvPr descr="index_files/figure-docx/bes_occup_mf_plot-1.png" id="101" name="Picture"/>
+                    <pic:cNvPr descr="index_files/figure-docx/bes_occup_mf_plot-1.png" id="105" name="Picture"/>
                     <pic:cNvPicPr>
                       <a:picLocks noChangeArrowheads="1" noChangeAspect="1"/>
                     </pic:cNvPicPr>
                   </pic:nvPicPr>
                   <pic:blipFill>
-                    <a:blip r:embed="rId99"/>
+                    <a:blip r:embed="rId103"/>
                     <a:stretch>
                       <a:fillRect/>
                     </a:stretch>
@@ -7728,9 +7785,9 @@
         </w:drawing>
       </w:r>
     </w:p>
-    <w:bookmarkEnd w:id="102"/>
-    <w:bookmarkEnd w:id="103"/>
-    <w:bookmarkStart w:id="113" w:name="Xe2aeb8de640d45a015548cf98437c820e84e13a"/>
+    <w:bookmarkEnd w:id="106"/>
+    <w:bookmarkEnd w:id="107"/>
+    <w:bookmarkStart w:id="117" w:name="Xe2aeb8de640d45a015548cf98437c820e84e13a"/>
     <w:p>
       <w:pPr>
         <w:pStyle w:val="Heading3"/>
@@ -7802,18 +7859,18 @@
                 <wp:inline>
                   <wp:extent cx="152400" cy="152400"/>
                   <wp:effectExtent b="0" l="0" r="0" t="0"/>
-                  <wp:docPr descr="" title="" id="104" name="Picture"/>
+                  <wp:docPr descr="" title="" id="108" name="Picture"/>
                   <a:graphic>
                     <a:graphicData uri="http://schemas.openxmlformats.org/drawingml/2006/picture">
                       <pic:pic>
                         <pic:nvPicPr>
-                          <pic:cNvPr descr="/Applications/RStudio.app/Contents/Resources/app/quarto/share/formats/docx/note.png" id="105" name="Picture"/>
+                          <pic:cNvPr descr="/Applications/RStudio.app/Contents/Resources/app/quarto/share/formats/docx/note.png" id="109" name="Picture"/>
                           <pic:cNvPicPr>
                             <a:picLocks noChangeArrowheads="1" noChangeAspect="1"/>
                           </pic:cNvPicPr>
                         </pic:nvPicPr>
                         <pic:blipFill>
-                          <a:blip r:embed="rId80"/>
+                          <a:blip r:embed="rId84"/>
                           <a:stretch>
                             <a:fillRect/>
                           </a:stretch>
@@ -7966,18 +8023,18 @@
           <wp:inline>
             <wp:extent cx="5334000" cy="4000500"/>
             <wp:effectExtent b="0" l="0" r="0" t="0"/>
-            <wp:docPr descr="" title="" id="107" name="Picture"/>
+            <wp:docPr descr="" title="" id="111" name="Picture"/>
             <a:graphic>
               <a:graphicData uri="http://schemas.openxmlformats.org/drawingml/2006/picture">
                 <pic:pic>
                   <pic:nvPicPr>
-                    <pic:cNvPr descr="index_files/figure-docx/bes_disoccup_plot-1.png" id="108" name="Picture"/>
+                    <pic:cNvPr descr="index_files/figure-docx/bes_disoccup_plot-1.png" id="112" name="Picture"/>
                     <pic:cNvPicPr>
                       <a:picLocks noChangeArrowheads="1" noChangeAspect="1"/>
                     </pic:cNvPicPr>
                   </pic:nvPicPr>
                   <pic:blipFill>
-                    <a:blip r:embed="rId106"/>
+                    <a:blip r:embed="rId110"/>
                     <a:stretch>
                       <a:fillRect/>
                     </a:stretch>
@@ -8004,7 +8061,7 @@
         </w:drawing>
       </w:r>
     </w:p>
-    <w:bookmarkStart w:id="112" w:name="maschi-e-femmine-al-2024"/>
+    <w:bookmarkStart w:id="116" w:name="maschi-e-femmine-al-2024"/>
     <w:p>
       <w:pPr>
         <w:pStyle w:val="Heading4"/>
@@ -8022,18 +8079,18 @@
           <wp:inline>
             <wp:extent cx="5334000" cy="4000500"/>
             <wp:effectExtent b="0" l="0" r="0" t="0"/>
-            <wp:docPr descr="" title="" id="110" name="Picture"/>
+            <wp:docPr descr="" title="" id="114" name="Picture"/>
             <a:graphic>
               <a:graphicData uri="http://schemas.openxmlformats.org/drawingml/2006/picture">
                 <pic:pic>
                   <pic:nvPicPr>
-                    <pic:cNvPr descr="index_files/figure-docx/bes_disoccup_m_f_plot-1.png" id="111" name="Picture"/>
+                    <pic:cNvPr descr="index_files/figure-docx/bes_disoccup_m_f_plot-1.png" id="115" name="Picture"/>
                     <pic:cNvPicPr>
                       <a:picLocks noChangeArrowheads="1" noChangeAspect="1"/>
                     </pic:cNvPicPr>
                   </pic:nvPicPr>
                   <pic:blipFill>
-                    <a:blip r:embed="rId109"/>
+                    <a:blip r:embed="rId113"/>
                     <a:stretch>
                       <a:fillRect/>
                     </a:stretch>
@@ -8060,9 +8117,9 @@
         </w:drawing>
       </w:r>
     </w:p>
-    <w:bookmarkEnd w:id="112"/>
-    <w:bookmarkEnd w:id="113"/>
-    <w:bookmarkStart w:id="120" w:name="formazione-e-neet"/>
+    <w:bookmarkEnd w:id="116"/>
+    <w:bookmarkEnd w:id="117"/>
+    <w:bookmarkStart w:id="124" w:name="formazione-e-neet"/>
     <w:p>
       <w:pPr>
         <w:pStyle w:val="Heading3"/>
@@ -8099,18 +8156,18 @@
           <wp:inline>
             <wp:extent cx="5334000" cy="4000500"/>
             <wp:effectExtent b="0" l="0" r="0" t="0"/>
-            <wp:docPr descr="" title="" id="115" name="Picture"/>
+            <wp:docPr descr="" title="" id="119" name="Picture"/>
             <a:graphic>
               <a:graphicData uri="http://schemas.openxmlformats.org/drawingml/2006/picture">
                 <pic:pic>
                   <pic:nvPicPr>
-                    <pic:cNvPr descr="index_files/figure-docx/bes_neet_plot-1.png" id="116" name="Picture"/>
+                    <pic:cNvPr descr="index_files/figure-docx/bes_neet_plot-1.png" id="120" name="Picture"/>
                     <pic:cNvPicPr>
                       <a:picLocks noChangeArrowheads="1" noChangeAspect="1"/>
                     </pic:cNvPicPr>
                   </pic:nvPicPr>
                   <pic:blipFill>
-                    <a:blip r:embed="rId114"/>
+                    <a:blip r:embed="rId118"/>
                     <a:stretch>
                       <a:fillRect/>
                     </a:stretch>
@@ -8146,18 +8203,18 @@
           <wp:inline>
             <wp:extent cx="5334000" cy="4000500"/>
             <wp:effectExtent b="0" l="0" r="0" t="0"/>
-            <wp:docPr descr="" title="" id="118" name="Picture"/>
+            <wp:docPr descr="" title="" id="122" name="Picture"/>
             <a:graphic>
               <a:graphicData uri="http://schemas.openxmlformats.org/drawingml/2006/picture">
                 <pic:pic>
                   <pic:nvPicPr>
-                    <pic:cNvPr descr="index_files/figure-docx/bes_formaz_plot-1.png" id="119" name="Picture"/>
+                    <pic:cNvPr descr="index_files/figure-docx/bes_formaz_plot-1.png" id="123" name="Picture"/>
                     <pic:cNvPicPr>
                       <a:picLocks noChangeArrowheads="1" noChangeAspect="1"/>
                     </pic:cNvPicPr>
                   </pic:nvPicPr>
                   <pic:blipFill>
-                    <a:blip r:embed="rId117"/>
+                    <a:blip r:embed="rId121"/>
                     <a:stretch>
                       <a:fillRect/>
                     </a:stretch>
@@ -8184,10 +8241,10 @@
         </w:drawing>
       </w:r>
     </w:p>
-    <w:bookmarkEnd w:id="120"/>
-    <w:bookmarkEnd w:id="121"/>
-    <w:bookmarkEnd w:id="122"/>
-    <w:bookmarkStart w:id="123" w:name="section-1"/>
+    <w:bookmarkEnd w:id="124"/>
+    <w:bookmarkEnd w:id="125"/>
+    <w:bookmarkEnd w:id="126"/>
+    <w:bookmarkStart w:id="127" w:name="section-1"/>
     <w:p>
       <w:pPr>
         <w:pStyle w:val="Heading1"/>
@@ -8196,8 +8253,8 @@
         <w:t xml:space="preserve">____</w:t>
       </w:r>
     </w:p>
-    <w:bookmarkEnd w:id="123"/>
-    <w:bookmarkStart w:id="131" w:name="X17434f237ff556da21455e8213a41950b5959d0"/>
+    <w:bookmarkEnd w:id="127"/>
+    <w:bookmarkStart w:id="135" w:name="X17434f237ff556da21455e8213a41950b5959d0"/>
     <w:p>
       <w:pPr>
         <w:pStyle w:val="Heading1"/>
@@ -8217,7 +8274,7 @@
         <w:t xml:space="preserve">, supportando una nuova visione strategiica e valorizzando sinergia tra obiettivi. [DPP 2025]”</w:t>
       </w:r>
     </w:p>
-    <w:bookmarkStart w:id="126" w:name="qualità-dei-servizi-e-ambiente"/>
+    <w:bookmarkStart w:id="130" w:name="qualità-dei-servizi-e-ambiente"/>
     <w:p>
       <w:pPr>
         <w:pStyle w:val="Heading2"/>
@@ -8234,7 +8291,7 @@
         <w:t xml:space="preserve">QUI HO MESSO SOLO LE TABELLE PERCHE’ SONO DATI UN PO’ DISPARATI: SI POTREBBE FARSI AIUTARE E FARE DELLE INFOGRAFICHE UN PO’ PIÙ INTERESSANTI…</w:t>
       </w:r>
     </w:p>
-    <w:bookmarkStart w:id="124" w:name="tbl-servizi-sul-territorio"/>
+    <w:bookmarkStart w:id="128" w:name="tbl-servizi-sul-territorio"/>
     <w:p>
       <w:pPr>
         <w:pStyle w:val="Heading3"/>
@@ -17481,8 +17538,8 @@
         </w:tc>
       </w:tr>
     </w:tbl>
-    <w:bookmarkEnd w:id="124"/>
-    <w:bookmarkStart w:id="125" w:name="tbl-ambiente"/>
+    <w:bookmarkEnd w:id="128"/>
+    <w:bookmarkStart w:id="129" w:name="tbl-ambiente"/>
     <w:p>
       <w:pPr>
         <w:pStyle w:val="Heading3"/>
@@ -26766,9 +26823,9 @@
         <w:br w:type="page"/>
       </w:r>
     </w:p>
-    <w:bookmarkEnd w:id="125"/>
-    <w:bookmarkEnd w:id="126"/>
-    <w:bookmarkStart w:id="130" w:name="musei-monumenti-e-biblioteche"/>
+    <w:bookmarkEnd w:id="129"/>
+    <w:bookmarkEnd w:id="130"/>
+    <w:bookmarkStart w:id="134" w:name="musei-monumenti-e-biblioteche"/>
     <w:p>
       <w:pPr>
         <w:pStyle w:val="Heading2"/>
@@ -29764,7 +29821,7 @@
       <w:r>
         <w:t xml:space="preserve"> </w:t>
       </w:r>
-      <w:hyperlink r:id="rId127">
+      <w:hyperlink r:id="rId131">
         <w:r>
           <w:rPr>
             <w:rStyle w:val="Hyperlink"/>
@@ -29885,18 +29942,18 @@
                 <wp:inline>
                   <wp:extent cx="152400" cy="152400"/>
                   <wp:effectExtent b="0" l="0" r="0" t="0"/>
-                  <wp:docPr descr="" title="" id="128" name="Picture"/>
+                  <wp:docPr descr="" title="" id="132" name="Picture"/>
                   <a:graphic>
                     <a:graphicData uri="http://schemas.openxmlformats.org/drawingml/2006/picture">
                       <pic:pic>
                         <pic:nvPicPr>
-                          <pic:cNvPr descr="/Applications/RStudio.app/Contents/Resources/app/quarto/share/formats/docx/note.png" id="129" name="Picture"/>
+                          <pic:cNvPr descr="/Applications/RStudio.app/Contents/Resources/app/quarto/share/formats/docx/note.png" id="133" name="Picture"/>
                           <pic:cNvPicPr>
                             <a:picLocks noChangeArrowheads="1" noChangeAspect="1"/>
                           </pic:cNvPicPr>
                         </pic:nvPicPr>
                         <pic:blipFill>
-                          <a:blip r:embed="rId80"/>
+                          <a:blip r:embed="rId84"/>
                           <a:stretch>
                             <a:fillRect/>
                           </a:stretch>
@@ -30082,9 +30139,9 @@
         <w:t xml:space="preserve">+ 14 Biblioteche convenzionate</w:t>
       </w:r>
     </w:p>
-    <w:bookmarkEnd w:id="130"/>
-    <w:bookmarkEnd w:id="131"/>
-    <w:bookmarkStart w:id="132" w:name="section-2"/>
+    <w:bookmarkEnd w:id="134"/>
+    <w:bookmarkEnd w:id="135"/>
+    <w:bookmarkStart w:id="136" w:name="section-2"/>
     <w:p>
       <w:pPr>
         <w:pStyle w:val="Heading1"/>
@@ -30093,8 +30150,8 @@
         <w:t xml:space="preserve">____</w:t>
       </w:r>
     </w:p>
-    <w:bookmarkEnd w:id="132"/>
-    <w:bookmarkStart w:id="141" w:name="X489f9b6d5a5b4aa949a31c95b266d11742852c4"/>
+    <w:bookmarkEnd w:id="136"/>
+    <w:bookmarkStart w:id="145" w:name="X489f9b6d5a5b4aa949a31c95b266d11742852c4"/>
     <w:p>
       <w:pPr>
         <w:pStyle w:val="Heading1"/>
@@ -30103,7 +30160,7 @@
         <w:t xml:space="preserve">AMBITO INTERVENTO: Valorizzare l’innovazione</w:t>
       </w:r>
     </w:p>
-    <w:bookmarkStart w:id="136" w:name="propensione-alla-brevettazione"/>
+    <w:bookmarkStart w:id="140" w:name="propensione-alla-brevettazione"/>
     <w:p>
       <w:pPr>
         <w:pStyle w:val="Heading3"/>
@@ -30193,207 +30250,6 @@
       </w:r>
       <w:r>
         <w:t xml:space="preserve">(ART-ER 2025)</w:t>
-      </w:r>
-    </w:p>
-    <w:p>
-      <w:pPr>
-        <w:pStyle w:val="BodyText"/>
-      </w:pPr>
-      <w:r>
-        <w:drawing>
-          <wp:inline>
-            <wp:extent cx="5334000" cy="4000500"/>
-            <wp:effectExtent b="0" l="0" r="0" t="0"/>
-            <wp:docPr descr="" title="" id="134" name="Picture"/>
-            <a:graphic>
-              <a:graphicData uri="http://schemas.openxmlformats.org/drawingml/2006/picture">
-                <pic:pic>
-                  <pic:nvPicPr>
-                    <pic:cNvPr descr="index_files/figure-docx/epo_plot-1.png" id="135" name="Picture"/>
-                    <pic:cNvPicPr>
-                      <a:picLocks noChangeArrowheads="1" noChangeAspect="1"/>
-                    </pic:cNvPicPr>
-                  </pic:nvPicPr>
-                  <pic:blipFill>
-                    <a:blip r:embed="rId133"/>
-                    <a:stretch>
-                      <a:fillRect/>
-                    </a:stretch>
-                  </pic:blipFill>
-                  <pic:spPr bwMode="auto">
-                    <a:xfrm>
-                      <a:off x="0" y="0"/>
-                      <a:ext cx="5334000" cy="4000500"/>
-                    </a:xfrm>
-                    <a:prstGeom prst="rect">
-                      <a:avLst/>
-                    </a:prstGeom>
-                    <a:noFill/>
-                    <a:ln w="9525">
-                      <a:noFill/>
-                      <a:headEnd/>
-                      <a:tailEnd/>
-                    </a:ln>
-                  </pic:spPr>
-                </pic:pic>
-              </a:graphicData>
-            </a:graphic>
-          </wp:inline>
-        </w:drawing>
-      </w:r>
-    </w:p>
-    <w:bookmarkEnd w:id="136"/>
-    <w:bookmarkStart w:id="140" w:name="Xa71a79528b1b5d68dca92dacbbef8e4061af517"/>
-    <w:p>
-      <w:pPr>
-        <w:pStyle w:val="Heading3"/>
-      </w:pPr>
-      <w:r>
-        <w:t xml:space="preserve">Indicatori DESIER di innovazione digitale</w:t>
-      </w:r>
-    </w:p>
-    <w:p>
-      <w:pPr>
-        <w:pStyle w:val="FirstParagraph"/>
-      </w:pPr>
-      <w:r>
-        <w:t xml:space="preserve">L’</w:t>
-      </w:r>
-      <w:r>
-        <w:rPr>
-          <w:b/>
-          <w:bCs/>
-        </w:rPr>
-        <w:t xml:space="preserve">indice DESIER</w:t>
-      </w:r>
-      <w:r>
-        <w:t xml:space="preserve"> </w:t>
-      </w:r>
-      <w:r>
-        <w:t xml:space="preserve">(</w:t>
-      </w:r>
-      <w:r>
-        <w:rPr>
-          <w:i/>
-          <w:iCs/>
-        </w:rPr>
-        <w:t xml:space="preserve">Digital Economy and Society Index for European Regions</w:t>
-      </w:r>
-      <w:r>
-        <w:t xml:space="preserve">) misura le performance digitali delle regioni europee, e consente di declinare l’indice DESI sull’innovazione digitale anche nei territori dell’Emilia-Romagna</w:t>
-      </w:r>
-      <w:r>
-        <w:t xml:space="preserve"> </w:t>
-      </w:r>
-      <w:r>
-        <w:t xml:space="preserve">(RE-R Agenda Digitale dell’Emilia-Romagna 2025)</w:t>
-      </w:r>
-      <w:r>
-        <w:t xml:space="preserve">. Questo strumento (realizzato nell’ambito delle attività di ADER, Agenda Digitale dell’Emilia-Romagna) consente l’analisi di 4 dimensioni di sviluppo principali che, a loro volta, combinano molti indicatori:</w:t>
-      </w:r>
-    </w:p>
-    <w:p>
-      <w:pPr>
-        <w:pStyle w:val="Compact"/>
-        <w:numPr>
-          <w:ilvl w:val="0"/>
-          <w:numId w:val="1008"/>
-        </w:numPr>
-      </w:pPr>
-      <w:r>
-        <w:rPr>
-          <w:rStyle w:val="VerbatimChar"/>
-        </w:rPr>
-        <w:t xml:space="preserve">Capitale Umano</w:t>
-      </w:r>
-      <w:r>
-        <w:t xml:space="preserve"> </w:t>
-      </w:r>
-      <w:r>
-        <w:t xml:space="preserve">- aspetti connessi alle competenze digitali, la presenza di specialisti del settore digitale, la presenza</w:t>
-      </w:r>
-      <w:r>
-        <w:t xml:space="preserve"> </w:t>
-      </w:r>
-      <w:r>
-        <w:t xml:space="preserve">e l’utilizzo di app, di alcuni servizi online, e social della Pubblica Amministrazione.</w:t>
-      </w:r>
-    </w:p>
-    <w:p>
-      <w:pPr>
-        <w:pStyle w:val="Compact"/>
-        <w:numPr>
-          <w:ilvl w:val="0"/>
-          <w:numId w:val="1008"/>
-        </w:numPr>
-      </w:pPr>
-      <w:r>
-        <w:rPr>
-          <w:rStyle w:val="VerbatimChar"/>
-        </w:rPr>
-        <w:t xml:space="preserve">Connettività</w:t>
-      </w:r>
-      <w:r>
-        <w:t xml:space="preserve"> </w:t>
-      </w:r>
-      <w:r>
-        <w:t xml:space="preserve">- grado di copertura Internet con rete fissa e mobile e il relativo grado di utilizzo nel territorio.</w:t>
-      </w:r>
-    </w:p>
-    <w:p>
-      <w:pPr>
-        <w:pStyle w:val="Compact"/>
-        <w:numPr>
-          <w:ilvl w:val="0"/>
-          <w:numId w:val="1008"/>
-        </w:numPr>
-      </w:pPr>
-      <w:r>
-        <w:rPr>
-          <w:rStyle w:val="VerbatimChar"/>
-        </w:rPr>
-        <w:t xml:space="preserve">Integrazione delle tecnologie digitali</w:t>
-      </w:r>
-      <w:r>
-        <w:t xml:space="preserve"> </w:t>
-      </w:r>
-      <w:r>
-        <w:t xml:space="preserve">- presenza sul territorio di imprese del mondo ICT, imprese innovative, start-up e finanziamenti provenienti dalla Smart Specialisation Strategy Regionale, con particolare riferimento alla digitalizzazione</w:t>
-      </w:r>
-      <w:r>
-        <w:t xml:space="preserve"> </w:t>
-      </w:r>
-      <w:r>
-        <w:t xml:space="preserve">del mondo produttivo.</w:t>
-      </w:r>
-    </w:p>
-    <w:p>
-      <w:pPr>
-        <w:pStyle w:val="Compact"/>
-        <w:numPr>
-          <w:ilvl w:val="0"/>
-          <w:numId w:val="1008"/>
-        </w:numPr>
-      </w:pPr>
-      <w:r>
-        <w:rPr>
-          <w:rStyle w:val="VerbatimChar"/>
-        </w:rPr>
-        <w:t xml:space="preserve">Servizi pubblici digitali</w:t>
-      </w:r>
-      <w:r>
-        <w:t xml:space="preserve"> </w:t>
-      </w:r>
-      <w:r>
-        <w:t xml:space="preserve">- vari aspetti connessi all’esistenza di open data e la possibilità di interagire online con la PA locale, o al grado di utilizzo delle Piattaforme abilitanti da parte dei cittadini e delle imprese (es. SPID, e servizi della sanità digitale online).</w:t>
-      </w:r>
-    </w:p>
-    <w:p>
-      <w:pPr>
-        <w:pStyle w:val="FirstParagraph"/>
-      </w:pPr>
-      <w:r>
-        <w:t xml:space="preserve">Questi indici mostrano una situazione abbastanza disomogenea tra Parma capoluogo (che si attesta tra i territori più avanzati della regione) e la provincia di Parma (che si posiziona in linea o al di sotto della media regionale).</w:t>
       </w:r>
     </w:p>
     <w:p>
@@ -30410,7 +30266,7 @@
               <a:graphicData uri="http://schemas.openxmlformats.org/drawingml/2006/picture">
                 <pic:pic>
                   <pic:nvPicPr>
-                    <pic:cNvPr descr="index_files/figure-docx/desier_barplot-1.png" id="139" name="Picture"/>
+                    <pic:cNvPr descr="index_files/figure-docx/epo_plot-1.png" id="139" name="Picture"/>
                     <pic:cNvPicPr>
                       <a:picLocks noChangeArrowheads="1" noChangeAspect="1"/>
                     </pic:cNvPicPr>
@@ -30444,8 +30300,209 @@
       </w:r>
     </w:p>
     <w:bookmarkEnd w:id="140"/>
-    <w:bookmarkEnd w:id="141"/>
-    <w:bookmarkStart w:id="164" w:name="fonti"/>
+    <w:bookmarkStart w:id="144" w:name="Xa71a79528b1b5d68dca92dacbbef8e4061af517"/>
+    <w:p>
+      <w:pPr>
+        <w:pStyle w:val="Heading3"/>
+      </w:pPr>
+      <w:r>
+        <w:t xml:space="preserve">Indicatori DESIER di innovazione digitale</w:t>
+      </w:r>
+    </w:p>
+    <w:p>
+      <w:pPr>
+        <w:pStyle w:val="FirstParagraph"/>
+      </w:pPr>
+      <w:r>
+        <w:t xml:space="preserve">L’</w:t>
+      </w:r>
+      <w:r>
+        <w:rPr>
+          <w:b/>
+          <w:bCs/>
+        </w:rPr>
+        <w:t xml:space="preserve">indice DESIER</w:t>
+      </w:r>
+      <w:r>
+        <w:t xml:space="preserve"> </w:t>
+      </w:r>
+      <w:r>
+        <w:t xml:space="preserve">(</w:t>
+      </w:r>
+      <w:r>
+        <w:rPr>
+          <w:i/>
+          <w:iCs/>
+        </w:rPr>
+        <w:t xml:space="preserve">Digital Economy and Society Index for European Regions</w:t>
+      </w:r>
+      <w:r>
+        <w:t xml:space="preserve">) misura le performance digitali delle regioni europee, e consente di declinare l’indice DESI sull’innovazione digitale anche nei territori dell’Emilia-Romagna</w:t>
+      </w:r>
+      <w:r>
+        <w:t xml:space="preserve"> </w:t>
+      </w:r>
+      <w:r>
+        <w:t xml:space="preserve">(RE-R Agenda Digitale dell’Emilia-Romagna 2025)</w:t>
+      </w:r>
+      <w:r>
+        <w:t xml:space="preserve">. Questo strumento (realizzato nell’ambito delle attività di ADER, Agenda Digitale dell’Emilia-Romagna) consente l’analisi di 4 dimensioni di sviluppo principali che, a loro volta, combinano molti indicatori:</w:t>
+      </w:r>
+    </w:p>
+    <w:p>
+      <w:pPr>
+        <w:pStyle w:val="Compact"/>
+        <w:numPr>
+          <w:ilvl w:val="0"/>
+          <w:numId w:val="1008"/>
+        </w:numPr>
+      </w:pPr>
+      <w:r>
+        <w:rPr>
+          <w:rStyle w:val="VerbatimChar"/>
+        </w:rPr>
+        <w:t xml:space="preserve">Capitale Umano</w:t>
+      </w:r>
+      <w:r>
+        <w:t xml:space="preserve"> </w:t>
+      </w:r>
+      <w:r>
+        <w:t xml:space="preserve">- aspetti connessi alle competenze digitali, la presenza di specialisti del settore digitale, la presenza</w:t>
+      </w:r>
+      <w:r>
+        <w:t xml:space="preserve"> </w:t>
+      </w:r>
+      <w:r>
+        <w:t xml:space="preserve">e l’utilizzo di app, di alcuni servizi online, e social della Pubblica Amministrazione.</w:t>
+      </w:r>
+    </w:p>
+    <w:p>
+      <w:pPr>
+        <w:pStyle w:val="Compact"/>
+        <w:numPr>
+          <w:ilvl w:val="0"/>
+          <w:numId w:val="1008"/>
+        </w:numPr>
+      </w:pPr>
+      <w:r>
+        <w:rPr>
+          <w:rStyle w:val="VerbatimChar"/>
+        </w:rPr>
+        <w:t xml:space="preserve">Connettività</w:t>
+      </w:r>
+      <w:r>
+        <w:t xml:space="preserve"> </w:t>
+      </w:r>
+      <w:r>
+        <w:t xml:space="preserve">- grado di copertura Internet con rete fissa e mobile e il relativo grado di utilizzo nel territorio.</w:t>
+      </w:r>
+    </w:p>
+    <w:p>
+      <w:pPr>
+        <w:pStyle w:val="Compact"/>
+        <w:numPr>
+          <w:ilvl w:val="0"/>
+          <w:numId w:val="1008"/>
+        </w:numPr>
+      </w:pPr>
+      <w:r>
+        <w:rPr>
+          <w:rStyle w:val="VerbatimChar"/>
+        </w:rPr>
+        <w:t xml:space="preserve">Integrazione delle tecnologie digitali</w:t>
+      </w:r>
+      <w:r>
+        <w:t xml:space="preserve"> </w:t>
+      </w:r>
+      <w:r>
+        <w:t xml:space="preserve">- presenza sul territorio di imprese del mondo ICT, imprese innovative, start-up e finanziamenti provenienti dalla Smart Specialisation Strategy Regionale, con particolare riferimento alla digitalizzazione</w:t>
+      </w:r>
+      <w:r>
+        <w:t xml:space="preserve"> </w:t>
+      </w:r>
+      <w:r>
+        <w:t xml:space="preserve">del mondo produttivo.</w:t>
+      </w:r>
+    </w:p>
+    <w:p>
+      <w:pPr>
+        <w:pStyle w:val="Compact"/>
+        <w:numPr>
+          <w:ilvl w:val="0"/>
+          <w:numId w:val="1008"/>
+        </w:numPr>
+      </w:pPr>
+      <w:r>
+        <w:rPr>
+          <w:rStyle w:val="VerbatimChar"/>
+        </w:rPr>
+        <w:t xml:space="preserve">Servizi pubblici digitali</w:t>
+      </w:r>
+      <w:r>
+        <w:t xml:space="preserve"> </w:t>
+      </w:r>
+      <w:r>
+        <w:t xml:space="preserve">- vari aspetti connessi all’esistenza di open data e la possibilità di interagire online con la PA locale, o al grado di utilizzo delle Piattaforme abilitanti da parte dei cittadini e delle imprese (es. SPID, e servizi della sanità digitale online).</w:t>
+      </w:r>
+    </w:p>
+    <w:p>
+      <w:pPr>
+        <w:pStyle w:val="FirstParagraph"/>
+      </w:pPr>
+      <w:r>
+        <w:t xml:space="preserve">Questi indici mostrano una situazione abbastanza disomogenea tra Parma capoluogo (che si attesta tra i territori più avanzati della regione) e la provincia di Parma (che si posiziona in linea o al di sotto della media regionale).</w:t>
+      </w:r>
+    </w:p>
+    <w:p>
+      <w:pPr>
+        <w:pStyle w:val="BodyText"/>
+      </w:pPr>
+      <w:r>
+        <w:drawing>
+          <wp:inline>
+            <wp:extent cx="5334000" cy="4000500"/>
+            <wp:effectExtent b="0" l="0" r="0" t="0"/>
+            <wp:docPr descr="" title="" id="142" name="Picture"/>
+            <a:graphic>
+              <a:graphicData uri="http://schemas.openxmlformats.org/drawingml/2006/picture">
+                <pic:pic>
+                  <pic:nvPicPr>
+                    <pic:cNvPr descr="index_files/figure-docx/desier_barplot-1.png" id="143" name="Picture"/>
+                    <pic:cNvPicPr>
+                      <a:picLocks noChangeArrowheads="1" noChangeAspect="1"/>
+                    </pic:cNvPicPr>
+                  </pic:nvPicPr>
+                  <pic:blipFill>
+                    <a:blip r:embed="rId141"/>
+                    <a:stretch>
+                      <a:fillRect/>
+                    </a:stretch>
+                  </pic:blipFill>
+                  <pic:spPr bwMode="auto">
+                    <a:xfrm>
+                      <a:off x="0" y="0"/>
+                      <a:ext cx="5334000" cy="4000500"/>
+                    </a:xfrm>
+                    <a:prstGeom prst="rect">
+                      <a:avLst/>
+                    </a:prstGeom>
+                    <a:noFill/>
+                    <a:ln w="9525">
+                      <a:noFill/>
+                      <a:headEnd/>
+                      <a:tailEnd/>
+                    </a:ln>
+                  </pic:spPr>
+                </pic:pic>
+              </a:graphicData>
+            </a:graphic>
+          </wp:inline>
+        </w:drawing>
+      </w:r>
+    </w:p>
+    <w:bookmarkEnd w:id="144"/>
+    <w:bookmarkEnd w:id="145"/>
+    <w:bookmarkStart w:id="168" w:name="fonti"/>
     <w:p>
       <w:pPr>
         <w:pStyle w:val="Heading1"/>
@@ -30454,8 +30511,8 @@
         <w:t xml:space="preserve">Fonti</w:t>
       </w:r>
     </w:p>
-    <w:bookmarkStart w:id="163" w:name="refs"/>
-    <w:bookmarkStart w:id="142" w:name="ref-art-erBrevettiDellEuropeanPatent2025"/>
+    <w:bookmarkStart w:id="167" w:name="refs"/>
+    <w:bookmarkStart w:id="146" w:name="ref-art-erBrevettiDellEuropeanPatent2025"/>
     <w:p>
       <w:pPr>
         <w:pStyle w:val="Bibliography"/>
@@ -30491,8 +30548,8 @@
         <w:t xml:space="preserve">.</w:t>
       </w:r>
     </w:p>
-    <w:bookmarkEnd w:id="142"/>
-    <w:bookmarkStart w:id="144" w:name="ref-eurostatPatentApplicationsEPO2024"/>
+    <w:bookmarkEnd w:id="146"/>
+    <w:bookmarkStart w:id="148" w:name="ref-eurostatPatentApplicationsEPO2024"/>
     <w:p>
       <w:pPr>
         <w:pStyle w:val="Bibliography"/>
@@ -30524,7 +30581,7 @@
       <w:r>
         <w:t xml:space="preserve"> </w:t>
       </w:r>
-      <w:hyperlink r:id="rId143">
+      <w:hyperlink r:id="rId147">
         <w:r>
           <w:rPr>
             <w:rStyle w:val="Hyperlink"/>
@@ -30536,8 +30593,8 @@
         <w:t xml:space="preserve">.</w:t>
       </w:r>
     </w:p>
-    <w:bookmarkEnd w:id="144"/>
-    <w:bookmarkStart w:id="146" w:name="ref-istatCondizioniDiSalute2022"/>
+    <w:bookmarkEnd w:id="148"/>
+    <w:bookmarkStart w:id="150" w:name="ref-istatCondizioniDiSalute2022"/>
     <w:p>
       <w:pPr>
         <w:pStyle w:val="Bibliography"/>
@@ -30557,7 +30614,7 @@
       <w:r>
         <w:t xml:space="preserve"> </w:t>
       </w:r>
-      <w:hyperlink r:id="rId145">
+      <w:hyperlink r:id="rId149">
         <w:r>
           <w:rPr>
             <w:rStyle w:val="Hyperlink"/>
@@ -30569,8 +30626,8 @@
         <w:t xml:space="preserve">.</w:t>
       </w:r>
     </w:p>
-    <w:bookmarkEnd w:id="146"/>
-    <w:bookmarkStart w:id="148" w:name="ref-istatDemoDemografiaCifre2025"/>
+    <w:bookmarkEnd w:id="150"/>
+    <w:bookmarkStart w:id="152" w:name="ref-istatDemoDemografiaCifre2025"/>
     <w:p>
       <w:pPr>
         <w:pStyle w:val="Bibliography"/>
@@ -30602,7 +30659,7 @@
       <w:r>
         <w:t xml:space="preserve"> </w:t>
       </w:r>
-      <w:hyperlink r:id="rId147">
+      <w:hyperlink r:id="rId151">
         <w:r>
           <w:rPr>
             <w:rStyle w:val="Hyperlink"/>
@@ -30614,8 +30671,8 @@
         <w:t xml:space="preserve">.</w:t>
       </w:r>
     </w:p>
-    <w:bookmarkEnd w:id="148"/>
-    <w:bookmarkStart w:id="150" w:name="ref-istatConfiniUnitaAmministrative2025a"/>
+    <w:bookmarkEnd w:id="152"/>
+    <w:bookmarkStart w:id="154" w:name="ref-istatConfiniUnitaAmministrative2025a"/>
     <w:p>
       <w:pPr>
         <w:pStyle w:val="Bibliography"/>
@@ -30635,7 +30692,7 @@
       <w:r>
         <w:t xml:space="preserve"> </w:t>
       </w:r>
-      <w:hyperlink r:id="rId149">
+      <w:hyperlink r:id="rId153">
         <w:r>
           <w:rPr>
             <w:rStyle w:val="Hyperlink"/>
@@ -30647,8 +30704,8 @@
         <w:t xml:space="preserve">.</w:t>
       </w:r>
     </w:p>
-    <w:bookmarkEnd w:id="150"/>
-    <w:bookmarkStart w:id="152" w:name="ref-istatBesTerritoriEmilia2025a"/>
+    <w:bookmarkEnd w:id="154"/>
+    <w:bookmarkStart w:id="156" w:name="ref-istatBesTerritoriEmilia2025a"/>
     <w:p>
       <w:pPr>
         <w:pStyle w:val="Bibliography"/>
@@ -30692,7 +30749,7 @@
       <w:r>
         <w:t xml:space="preserve"> </w:t>
       </w:r>
-      <w:hyperlink r:id="rId151">
+      <w:hyperlink r:id="rId155">
         <w:r>
           <w:rPr>
             <w:rStyle w:val="Hyperlink"/>
@@ -30704,8 +30761,8 @@
         <w:t xml:space="preserve">.</w:t>
       </w:r>
     </w:p>
-    <w:bookmarkEnd w:id="152"/>
-    <w:bookmarkStart w:id="154" w:name="Xb34254e6c814bb0d0064f2dfbe675e8843c13b5"/>
+    <w:bookmarkEnd w:id="156"/>
+    <w:bookmarkStart w:id="158" w:name="Xb34254e6c814bb0d0064f2dfbe675e8843c13b5"/>
     <w:p>
       <w:pPr>
         <w:pStyle w:val="Bibliography"/>
@@ -30731,7 +30788,7 @@
       <w:r>
         <w:t xml:space="preserve"> </w:t>
       </w:r>
-      <w:hyperlink r:id="rId153">
+      <w:hyperlink r:id="rId157">
         <w:r>
           <w:rPr>
             <w:rStyle w:val="Hyperlink"/>
@@ -30743,8 +30800,8 @@
         <w:t xml:space="preserve">.</w:t>
       </w:r>
     </w:p>
-    <w:bookmarkEnd w:id="154"/>
-    <w:bookmarkStart w:id="156" w:name="X2dad0e74d362bae1b9ea60c8681a301ca68adb2"/>
+    <w:bookmarkEnd w:id="158"/>
+    <w:bookmarkStart w:id="160" w:name="X2dad0e74d362bae1b9ea60c8681a301ca68adb2"/>
     <w:p>
       <w:pPr>
         <w:pStyle w:val="Bibliography"/>
@@ -30764,7 +30821,7 @@
       <w:r>
         <w:t xml:space="preserve"> </w:t>
       </w:r>
-      <w:hyperlink r:id="rId155">
+      <w:hyperlink r:id="rId159">
         <w:r>
           <w:rPr>
             <w:rStyle w:val="Hyperlink"/>
@@ -30776,8 +30833,8 @@
         <w:t xml:space="preserve">.</w:t>
       </w:r>
     </w:p>
-    <w:bookmarkEnd w:id="156"/>
-    <w:bookmarkStart w:id="158" w:name="X55cb39cda2c3893020072fedbd198e0f73c2abf"/>
+    <w:bookmarkEnd w:id="160"/>
+    <w:bookmarkStart w:id="162" w:name="X55cb39cda2c3893020072fedbd198e0f73c2abf"/>
     <w:p>
       <w:pPr>
         <w:pStyle w:val="Bibliography"/>
@@ -30797,7 +30854,7 @@
       <w:r>
         <w:t xml:space="preserve"> </w:t>
       </w:r>
-      <w:hyperlink r:id="rId157">
+      <w:hyperlink r:id="rId161">
         <w:r>
           <w:rPr>
             <w:rStyle w:val="Hyperlink"/>
@@ -30809,8 +30866,8 @@
         <w:t xml:space="preserve">.</w:t>
       </w:r>
     </w:p>
-    <w:bookmarkEnd w:id="158"/>
-    <w:bookmarkStart w:id="160" w:name="X51c05c0937d28e07205812bde6bdc824159d2ba"/>
+    <w:bookmarkEnd w:id="162"/>
+    <w:bookmarkStart w:id="164" w:name="X51c05c0937d28e07205812bde6bdc824159d2ba"/>
     <w:p>
       <w:pPr>
         <w:pStyle w:val="Bibliography"/>
@@ -30830,7 +30887,7 @@
       <w:r>
         <w:t xml:space="preserve"> </w:t>
       </w:r>
-      <w:hyperlink r:id="rId159">
+      <w:hyperlink r:id="rId163">
         <w:r>
           <w:rPr>
             <w:rStyle w:val="Hyperlink"/>
@@ -30842,8 +30899,8 @@
         <w:t xml:space="preserve">.</w:t>
       </w:r>
     </w:p>
-    <w:bookmarkEnd w:id="160"/>
-    <w:bookmarkStart w:id="162" w:name="X4be10cd200e436111ca0c3c595ebcfdca0c9990"/>
+    <w:bookmarkEnd w:id="164"/>
+    <w:bookmarkStart w:id="166" w:name="X4be10cd200e436111ca0c3c595ebcfdca0c9990"/>
     <w:p>
       <w:pPr>
         <w:pStyle w:val="Bibliography"/>
@@ -30863,7 +30920,7 @@
       <w:r>
         <w:t xml:space="preserve"> </w:t>
       </w:r>
-      <w:hyperlink r:id="rId161">
+      <w:hyperlink r:id="rId165">
         <w:r>
           <w:rPr>
             <w:rStyle w:val="Hyperlink"/>
@@ -30875,9 +30932,9 @@
         <w:t xml:space="preserve">.</w:t>
       </w:r>
     </w:p>
-    <w:bookmarkEnd w:id="162"/>
-    <w:bookmarkEnd w:id="163"/>
-    <w:bookmarkEnd w:id="164"/>
+    <w:bookmarkEnd w:id="166"/>
+    <w:bookmarkEnd w:id="167"/>
+    <w:bookmarkEnd w:id="168"/>
     <w:sectPr>
       <w:footnotePr>
         <w:numRestart w:val="eachSect"/>

</xml_diff>